<commit_message>
Thêm mô tả chi tiết cho giao diện phân công giảng dạy và thống kê báo cáo
</commit_message>
<xml_diff>
--- a/6.UserInterfaceDesign.docx
+++ b/6.UserInterfaceDesign.docx
@@ -71,6 +71,7 @@
     <w:p>
       <w:pPr>
         <w:spacing w:after="0" w:line="360" w:lineRule="auto"/>
+        <w:jc w:val="center"/>
         <w:rPr>
           <w:rFonts w:ascii="Times New Roman" w:hAnsi="Times New Roman" w:cs="Times New Roman"/>
           <w:b/>
@@ -85,59 +86,42 @@
           <w:sz w:val="26"/>
           <w:szCs w:val="26"/>
         </w:rPr>
-        <w:br/>
+        <w:drawing>
+          <wp:inline distT="0" distB="0" distL="0" distR="0" wp14:anchorId="68369C3E" wp14:editId="255F3F9F">
+            <wp:extent cx="5873262" cy="4698845"/>
+            <wp:effectExtent l="0" t="0" r="0" b="6985"/>
+            <wp:docPr id="159365252" name="Picture 1"/>
+            <wp:cNvGraphicFramePr>
+              <a:graphicFrameLocks xmlns:a="http://schemas.openxmlformats.org/drawingml/2006/main" noChangeAspect="1"/>
+            </wp:cNvGraphicFramePr>
+            <a:graphic xmlns:a="http://schemas.openxmlformats.org/drawingml/2006/main">
+              <a:graphicData uri="http://schemas.openxmlformats.org/drawingml/2006/picture">
+                <pic:pic xmlns:pic="http://schemas.openxmlformats.org/drawingml/2006/picture">
+                  <pic:nvPicPr>
+                    <pic:cNvPr id="159365252" name=""/>
+                    <pic:cNvPicPr/>
+                  </pic:nvPicPr>
+                  <pic:blipFill>
+                    <a:blip r:embed="rId5"/>
+                    <a:stretch>
+                      <a:fillRect/>
+                    </a:stretch>
+                  </pic:blipFill>
+                  <pic:spPr>
+                    <a:xfrm>
+                      <a:off x="0" y="0"/>
+                      <a:ext cx="5892000" cy="4713837"/>
+                    </a:xfrm>
+                    <a:prstGeom prst="rect">
+                      <a:avLst/>
+                    </a:prstGeom>
+                  </pic:spPr>
+                </pic:pic>
+              </a:graphicData>
+            </a:graphic>
+          </wp:inline>
+        </w:drawing>
       </w:r>
-      <w:r>
-        <w:rPr>
-          <w:rFonts w:ascii="Times New Roman" w:hAnsi="Times New Roman" w:cs="Times New Roman"/>
-          <w:b/>
-          <w:bCs/>
-          <w:sz w:val="26"/>
-          <w:szCs w:val="26"/>
-        </w:rPr>
-        <w:t>2.1</w:t>
-      </w:r>
-      <w:r>
-        <w:rPr>
-          <w:rFonts w:ascii="Times New Roman" w:hAnsi="Times New Roman" w:cs="Times New Roman"/>
-          <w:b/>
-          <w:bCs/>
-          <w:sz w:val="26"/>
-          <w:szCs w:val="26"/>
-        </w:rPr>
-        <w:t>4</w:t>
-      </w:r>
-      <w:r>
-        <w:rPr>
-          <w:rFonts w:ascii="Times New Roman" w:hAnsi="Times New Roman" w:cs="Times New Roman"/>
-          <w:b/>
-          <w:bCs/>
-          <w:sz w:val="26"/>
-          <w:szCs w:val="26"/>
-        </w:rPr>
-        <w:t>.2.</w:t>
-      </w:r>
-      <w:r>
-        <w:rPr>
-          <w:rFonts w:ascii="Times New Roman" w:hAnsi="Times New Roman" w:cs="Times New Roman"/>
-          <w:b/>
-          <w:bCs/>
-          <w:sz w:val="26"/>
-          <w:szCs w:val="26"/>
-        </w:rPr>
-        <w:tab/>
-        <w:t>Đặc tả chi tiết</w:t>
-      </w:r>
-    </w:p>
-    <w:p>
-      <w:pPr>
-        <w:spacing w:after="0" w:line="360" w:lineRule="auto"/>
-        <w:rPr>
-          <w:rFonts w:ascii="Times New Roman" w:hAnsi="Times New Roman" w:cs="Times New Roman"/>
-          <w:sz w:val="26"/>
-          <w:szCs w:val="26"/>
-        </w:rPr>
-      </w:pPr>
     </w:p>
     <w:p>
       <w:pPr>
@@ -158,6 +142,2072 @@
           <w:sz w:val="26"/>
           <w:szCs w:val="26"/>
         </w:rPr>
+        <w:t>2.14.2.</w:t>
+      </w:r>
+      <w:r>
+        <w:rPr>
+          <w:rFonts w:ascii="Times New Roman" w:hAnsi="Times New Roman" w:cs="Times New Roman"/>
+          <w:b/>
+          <w:bCs/>
+          <w:sz w:val="26"/>
+          <w:szCs w:val="26"/>
+        </w:rPr>
+        <w:tab/>
+        <w:t>Đặc tả chi tiết</w:t>
+      </w:r>
+    </w:p>
+    <w:tbl>
+      <w:tblPr>
+        <w:tblStyle w:val="TableGrid3"/>
+        <w:tblW w:w="0" w:type="auto"/>
+        <w:jc w:val="center"/>
+        <w:tblLook w:val="04A0" w:firstRow="1" w:lastRow="0" w:firstColumn="1" w:lastColumn="0" w:noHBand="0" w:noVBand="1"/>
+      </w:tblPr>
+      <w:tblGrid>
+        <w:gridCol w:w="1417"/>
+        <w:gridCol w:w="2462"/>
+        <w:gridCol w:w="227"/>
+        <w:gridCol w:w="1559"/>
+        <w:gridCol w:w="1291"/>
+        <w:gridCol w:w="1847"/>
+      </w:tblGrid>
+      <w:tr>
+        <w:trPr>
+          <w:jc w:val="center"/>
+        </w:trPr>
+        <w:tc>
+          <w:tcPr>
+            <w:tcW w:w="1417" w:type="dxa"/>
+            <w:shd w:val="clear" w:color="auto" w:fill="C1E4F5" w:themeFill="accent1" w:themeFillTint="33"/>
+            <w:vAlign w:val="center"/>
+          </w:tcPr>
+          <w:p>
+            <w:pPr>
+              <w:spacing w:line="360" w:lineRule="auto"/>
+              <w:contextualSpacing/>
+              <w:rPr>
+                <w:rFonts w:ascii="Times New Roman" w:hAnsi="Times New Roman" w:cs="Times New Roman"/>
+                <w:sz w:val="26"/>
+                <w:szCs w:val="26"/>
+              </w:rPr>
+            </w:pPr>
+            <w:r>
+              <w:rPr>
+                <w:rStyle w:val="Strong"/>
+                <w:rFonts w:ascii="Times New Roman" w:hAnsi="Times New Roman" w:cs="Times New Roman"/>
+                <w:color w:val="1F1F1F"/>
+                <w:sz w:val="26"/>
+                <w:szCs w:val="26"/>
+                <w:bdr w:val="none" w:sz="0" w:space="0" w:color="auto" w:frame="1"/>
+              </w:rPr>
+              <w:t>Màn hình</w:t>
+            </w:r>
+          </w:p>
+        </w:tc>
+        <w:tc>
+          <w:tcPr>
+            <w:tcW w:w="7386" w:type="dxa"/>
+            <w:gridSpan w:val="5"/>
+            <w:vAlign w:val="center"/>
+          </w:tcPr>
+          <w:p>
+            <w:pPr>
+              <w:spacing w:line="360" w:lineRule="auto"/>
+              <w:contextualSpacing/>
+              <w:rPr>
+                <w:rFonts w:ascii="Times New Roman" w:hAnsi="Times New Roman" w:cs="Times New Roman"/>
+                <w:sz w:val="26"/>
+                <w:szCs w:val="26"/>
+              </w:rPr>
+            </w:pPr>
+            <w:r>
+              <w:rPr>
+                <w:rStyle w:val="Strong"/>
+                <w:rFonts w:ascii="Times New Roman" w:hAnsi="Times New Roman" w:cs="Times New Roman"/>
+                <w:color w:val="1F1F1F"/>
+                <w:sz w:val="26"/>
+                <w:szCs w:val="26"/>
+                <w:bdr w:val="none" w:sz="0" w:space="0" w:color="auto" w:frame="1"/>
+              </w:rPr>
+              <w:t>Phân công giảng viên</w:t>
+            </w:r>
+          </w:p>
+        </w:tc>
+      </w:tr>
+      <w:tr>
+        <w:trPr>
+          <w:jc w:val="center"/>
+        </w:trPr>
+        <w:tc>
+          <w:tcPr>
+            <w:tcW w:w="1417" w:type="dxa"/>
+            <w:shd w:val="clear" w:color="auto" w:fill="C1E4F5" w:themeFill="accent1" w:themeFillTint="33"/>
+            <w:vAlign w:val="center"/>
+          </w:tcPr>
+          <w:p>
+            <w:pPr>
+              <w:spacing w:line="360" w:lineRule="auto"/>
+              <w:contextualSpacing/>
+              <w:rPr>
+                <w:rFonts w:ascii="Times New Roman" w:hAnsi="Times New Roman" w:cs="Times New Roman"/>
+                <w:b/>
+                <w:bCs/>
+                <w:sz w:val="26"/>
+                <w:szCs w:val="26"/>
+              </w:rPr>
+            </w:pPr>
+            <w:r>
+              <w:rPr>
+                <w:rFonts w:ascii="Times New Roman" w:hAnsi="Times New Roman" w:cs="Times New Roman"/>
+                <w:b/>
+                <w:bCs/>
+                <w:color w:val="1F1F1F"/>
+                <w:sz w:val="26"/>
+                <w:szCs w:val="26"/>
+                <w:bdr w:val="none" w:sz="0" w:space="0" w:color="auto" w:frame="1"/>
+              </w:rPr>
+              <w:t>Mô tả</w:t>
+            </w:r>
+          </w:p>
+        </w:tc>
+        <w:tc>
+          <w:tcPr>
+            <w:tcW w:w="7386" w:type="dxa"/>
+            <w:gridSpan w:val="5"/>
+            <w:vAlign w:val="center"/>
+          </w:tcPr>
+          <w:p>
+            <w:pPr>
+              <w:spacing w:line="360" w:lineRule="auto"/>
+              <w:contextualSpacing/>
+              <w:rPr>
+                <w:rFonts w:ascii="Times New Roman" w:hAnsi="Times New Roman" w:cs="Times New Roman"/>
+                <w:sz w:val="26"/>
+                <w:szCs w:val="26"/>
+              </w:rPr>
+            </w:pPr>
+            <w:r>
+              <w:rPr>
+                <w:rFonts w:ascii="Times New Roman" w:hAnsi="Times New Roman" w:cs="Times New Roman"/>
+                <w:color w:val="1F1F1F"/>
+                <w:sz w:val="26"/>
+                <w:szCs w:val="26"/>
+                <w:bdr w:val="none" w:sz="0" w:space="0" w:color="auto" w:frame="1"/>
+              </w:rPr>
+              <w:t>Hệ thống cho phép quản trị viên quản lý, theo dõi tải giảng dạy và phân công lớp học cho giảng viên.</w:t>
+            </w:r>
+          </w:p>
+        </w:tc>
+      </w:tr>
+      <w:tr>
+        <w:trPr>
+          <w:jc w:val="center"/>
+        </w:trPr>
+        <w:tc>
+          <w:tcPr>
+            <w:tcW w:w="1417" w:type="dxa"/>
+            <w:shd w:val="clear" w:color="auto" w:fill="C1E4F5" w:themeFill="accent1" w:themeFillTint="33"/>
+            <w:vAlign w:val="center"/>
+          </w:tcPr>
+          <w:p>
+            <w:pPr>
+              <w:spacing w:line="360" w:lineRule="auto"/>
+              <w:contextualSpacing/>
+              <w:rPr>
+                <w:rFonts w:ascii="Times New Roman" w:hAnsi="Times New Roman" w:cs="Times New Roman"/>
+                <w:b/>
+                <w:bCs/>
+                <w:sz w:val="26"/>
+                <w:szCs w:val="26"/>
+              </w:rPr>
+            </w:pPr>
+            <w:r>
+              <w:rPr>
+                <w:rFonts w:ascii="Times New Roman" w:hAnsi="Times New Roman" w:cs="Times New Roman"/>
+                <w:b/>
+                <w:bCs/>
+                <w:color w:val="1F1F1F"/>
+                <w:sz w:val="26"/>
+                <w:szCs w:val="26"/>
+                <w:bdr w:val="none" w:sz="0" w:space="0" w:color="auto" w:frame="1"/>
+              </w:rPr>
+              <w:t>Truy cập</w:t>
+            </w:r>
+          </w:p>
+        </w:tc>
+        <w:tc>
+          <w:tcPr>
+            <w:tcW w:w="7386" w:type="dxa"/>
+            <w:gridSpan w:val="5"/>
+            <w:vAlign w:val="center"/>
+          </w:tcPr>
+          <w:p>
+            <w:pPr>
+              <w:spacing w:line="360" w:lineRule="auto"/>
+              <w:contextualSpacing/>
+              <w:rPr>
+                <w:rFonts w:ascii="Times New Roman" w:hAnsi="Times New Roman" w:cs="Times New Roman"/>
+                <w:sz w:val="26"/>
+                <w:szCs w:val="26"/>
+              </w:rPr>
+            </w:pPr>
+            <w:r>
+              <w:rPr>
+                <w:rFonts w:ascii="Times New Roman" w:hAnsi="Times New Roman" w:cs="Times New Roman"/>
+                <w:color w:val="1F1F1F"/>
+                <w:sz w:val="26"/>
+                <w:szCs w:val="26"/>
+                <w:bdr w:val="none" w:sz="0" w:space="0" w:color="auto" w:frame="1"/>
+              </w:rPr>
+              <w:t>Quản trị viên bấm vào menu "Phân công GV" ở thanh điều hướng bên trái.</w:t>
+            </w:r>
+          </w:p>
+        </w:tc>
+      </w:tr>
+      <w:tr>
+        <w:trPr>
+          <w:jc w:val="center"/>
+        </w:trPr>
+        <w:tc>
+          <w:tcPr>
+            <w:tcW w:w="1417" w:type="dxa"/>
+            <w:shd w:val="clear" w:color="auto" w:fill="C1E4F5" w:themeFill="accent1" w:themeFillTint="33"/>
+            <w:vAlign w:val="center"/>
+          </w:tcPr>
+          <w:p>
+            <w:pPr>
+              <w:spacing w:line="360" w:lineRule="auto"/>
+              <w:contextualSpacing/>
+              <w:rPr>
+                <w:rFonts w:ascii="Times New Roman" w:hAnsi="Times New Roman" w:cs="Times New Roman"/>
+                <w:b/>
+                <w:bCs/>
+                <w:sz w:val="26"/>
+                <w:szCs w:val="26"/>
+              </w:rPr>
+            </w:pPr>
+            <w:r>
+              <w:rPr>
+                <w:rFonts w:ascii="Times New Roman" w:hAnsi="Times New Roman" w:cs="Times New Roman"/>
+                <w:b/>
+                <w:bCs/>
+                <w:color w:val="1F1F1F"/>
+                <w:sz w:val="26"/>
+                <w:szCs w:val="26"/>
+                <w:bdr w:val="none" w:sz="0" w:space="0" w:color="auto" w:frame="1"/>
+              </w:rPr>
+              <w:t>Đối tượng</w:t>
+            </w:r>
+          </w:p>
+        </w:tc>
+        <w:tc>
+          <w:tcPr>
+            <w:tcW w:w="7386" w:type="dxa"/>
+            <w:gridSpan w:val="5"/>
+            <w:vAlign w:val="center"/>
+          </w:tcPr>
+          <w:p>
+            <w:pPr>
+              <w:spacing w:line="360" w:lineRule="auto"/>
+              <w:contextualSpacing/>
+              <w:rPr>
+                <w:rFonts w:ascii="Times New Roman" w:hAnsi="Times New Roman" w:cs="Times New Roman"/>
+                <w:sz w:val="26"/>
+                <w:szCs w:val="26"/>
+              </w:rPr>
+            </w:pPr>
+            <w:r>
+              <w:rPr>
+                <w:rFonts w:ascii="Times New Roman" w:hAnsi="Times New Roman" w:cs="Times New Roman"/>
+                <w:color w:val="1F1F1F"/>
+                <w:sz w:val="26"/>
+                <w:szCs w:val="26"/>
+                <w:bdr w:val="none" w:sz="0" w:space="0" w:color="auto" w:frame="1"/>
+              </w:rPr>
+              <w:t>Quản trị viên (Admin)</w:t>
+            </w:r>
+          </w:p>
+        </w:tc>
+      </w:tr>
+      <w:tr>
+        <w:trPr>
+          <w:jc w:val="center"/>
+        </w:trPr>
+        <w:tc>
+          <w:tcPr>
+            <w:tcW w:w="8803" w:type="dxa"/>
+            <w:gridSpan w:val="6"/>
+          </w:tcPr>
+          <w:p>
+            <w:pPr>
+              <w:spacing w:line="360" w:lineRule="auto"/>
+              <w:contextualSpacing/>
+              <w:rPr>
+                <w:rFonts w:ascii="Times New Roman" w:hAnsi="Times New Roman" w:cs="Times New Roman"/>
+                <w:b/>
+                <w:sz w:val="26"/>
+                <w:szCs w:val="26"/>
+              </w:rPr>
+            </w:pPr>
+            <w:r>
+              <w:rPr>
+                <w:rFonts w:ascii="Times New Roman" w:hAnsi="Times New Roman" w:cs="Times New Roman"/>
+                <w:b/>
+                <w:sz w:val="26"/>
+                <w:szCs w:val="26"/>
+              </w:rPr>
+              <w:t>Nội dung</w:t>
+            </w:r>
+          </w:p>
+        </w:tc>
+      </w:tr>
+      <w:tr>
+        <w:trPr>
+          <w:jc w:val="center"/>
+        </w:trPr>
+        <w:tc>
+          <w:tcPr>
+            <w:tcW w:w="1417" w:type="dxa"/>
+            <w:shd w:val="clear" w:color="auto" w:fill="C1E4F5" w:themeFill="accent1" w:themeFillTint="33"/>
+            <w:vAlign w:val="center"/>
+          </w:tcPr>
+          <w:p>
+            <w:pPr>
+              <w:spacing w:line="360" w:lineRule="auto"/>
+              <w:contextualSpacing/>
+              <w:rPr>
+                <w:rFonts w:ascii="Times New Roman" w:hAnsi="Times New Roman" w:cs="Times New Roman"/>
+                <w:b/>
+                <w:sz w:val="26"/>
+                <w:szCs w:val="26"/>
+              </w:rPr>
+            </w:pPr>
+            <w:r>
+              <w:rPr>
+                <w:rStyle w:val="Strong"/>
+                <w:rFonts w:ascii="Times New Roman" w:hAnsi="Times New Roman" w:cs="Times New Roman"/>
+                <w:color w:val="1F1F1F"/>
+                <w:sz w:val="26"/>
+                <w:szCs w:val="26"/>
+                <w:bdr w:val="none" w:sz="0" w:space="0" w:color="auto" w:frame="1"/>
+              </w:rPr>
+              <w:t>Mục</w:t>
+            </w:r>
+          </w:p>
+        </w:tc>
+        <w:tc>
+          <w:tcPr>
+            <w:tcW w:w="2462" w:type="dxa"/>
+            <w:shd w:val="clear" w:color="auto" w:fill="C1E4F5" w:themeFill="accent1" w:themeFillTint="33"/>
+            <w:vAlign w:val="center"/>
+          </w:tcPr>
+          <w:p>
+            <w:pPr>
+              <w:spacing w:line="360" w:lineRule="auto"/>
+              <w:contextualSpacing/>
+              <w:rPr>
+                <w:rFonts w:ascii="Times New Roman" w:hAnsi="Times New Roman" w:cs="Times New Roman"/>
+                <w:b/>
+                <w:sz w:val="26"/>
+                <w:szCs w:val="26"/>
+              </w:rPr>
+            </w:pPr>
+            <w:r>
+              <w:rPr>
+                <w:rStyle w:val="Strong"/>
+                <w:rFonts w:ascii="Times New Roman" w:hAnsi="Times New Roman" w:cs="Times New Roman"/>
+                <w:color w:val="1F1F1F"/>
+                <w:sz w:val="26"/>
+                <w:szCs w:val="26"/>
+                <w:bdr w:val="none" w:sz="0" w:space="0" w:color="auto" w:frame="1"/>
+              </w:rPr>
+              <w:t>Kiểu</w:t>
+            </w:r>
+          </w:p>
+        </w:tc>
+        <w:tc>
+          <w:tcPr>
+            <w:tcW w:w="1786" w:type="dxa"/>
+            <w:gridSpan w:val="2"/>
+            <w:shd w:val="clear" w:color="auto" w:fill="C1E4F5" w:themeFill="accent1" w:themeFillTint="33"/>
+            <w:vAlign w:val="center"/>
+          </w:tcPr>
+          <w:p>
+            <w:pPr>
+              <w:spacing w:line="360" w:lineRule="auto"/>
+              <w:contextualSpacing/>
+              <w:rPr>
+                <w:rFonts w:ascii="Times New Roman" w:hAnsi="Times New Roman" w:cs="Times New Roman"/>
+                <w:b/>
+                <w:sz w:val="26"/>
+                <w:szCs w:val="26"/>
+              </w:rPr>
+            </w:pPr>
+            <w:r>
+              <w:rPr>
+                <w:rStyle w:val="Strong"/>
+                <w:rFonts w:ascii="Times New Roman" w:hAnsi="Times New Roman" w:cs="Times New Roman"/>
+                <w:color w:val="1F1F1F"/>
+                <w:sz w:val="26"/>
+                <w:szCs w:val="26"/>
+                <w:bdr w:val="none" w:sz="0" w:space="0" w:color="auto" w:frame="1"/>
+              </w:rPr>
+              <w:t>Dữ liệu</w:t>
+            </w:r>
+          </w:p>
+        </w:tc>
+        <w:tc>
+          <w:tcPr>
+            <w:tcW w:w="3138" w:type="dxa"/>
+            <w:gridSpan w:val="2"/>
+            <w:shd w:val="clear" w:color="auto" w:fill="C1E4F5" w:themeFill="accent1" w:themeFillTint="33"/>
+            <w:vAlign w:val="center"/>
+          </w:tcPr>
+          <w:p>
+            <w:pPr>
+              <w:spacing w:line="360" w:lineRule="auto"/>
+              <w:contextualSpacing/>
+              <w:rPr>
+                <w:rFonts w:ascii="Times New Roman" w:hAnsi="Times New Roman" w:cs="Times New Roman"/>
+                <w:b/>
+                <w:sz w:val="26"/>
+                <w:szCs w:val="26"/>
+              </w:rPr>
+            </w:pPr>
+            <w:r>
+              <w:rPr>
+                <w:rStyle w:val="Strong"/>
+                <w:rFonts w:ascii="Times New Roman" w:hAnsi="Times New Roman" w:cs="Times New Roman"/>
+                <w:color w:val="1F1F1F"/>
+                <w:sz w:val="26"/>
+                <w:szCs w:val="26"/>
+                <w:bdr w:val="none" w:sz="0" w:space="0" w:color="auto" w:frame="1"/>
+              </w:rPr>
+              <w:t>Mô tả</w:t>
+            </w:r>
+          </w:p>
+        </w:tc>
+      </w:tr>
+      <w:tr>
+        <w:trPr>
+          <w:jc w:val="center"/>
+        </w:trPr>
+        <w:tc>
+          <w:tcPr>
+            <w:tcW w:w="1417" w:type="dxa"/>
+            <w:vAlign w:val="center"/>
+          </w:tcPr>
+          <w:p>
+            <w:pPr>
+              <w:spacing w:line="360" w:lineRule="auto"/>
+              <w:contextualSpacing/>
+              <w:rPr>
+                <w:rFonts w:ascii="Times New Roman" w:hAnsi="Times New Roman" w:cs="Times New Roman"/>
+                <w:sz w:val="26"/>
+                <w:szCs w:val="26"/>
+              </w:rPr>
+            </w:pPr>
+            <w:r>
+              <w:rPr>
+                <w:rFonts w:ascii="Times New Roman" w:hAnsi="Times New Roman" w:cs="Times New Roman"/>
+                <w:color w:val="1F1F1F"/>
+                <w:sz w:val="26"/>
+                <w:szCs w:val="26"/>
+                <w:bdr w:val="none" w:sz="0" w:space="0" w:color="auto" w:frame="1"/>
+              </w:rPr>
+              <w:lastRenderedPageBreak/>
+              <w:t>1</w:t>
+            </w:r>
+          </w:p>
+        </w:tc>
+        <w:tc>
+          <w:tcPr>
+            <w:tcW w:w="2462" w:type="dxa"/>
+            <w:vAlign w:val="center"/>
+          </w:tcPr>
+          <w:p>
+            <w:pPr>
+              <w:spacing w:line="360" w:lineRule="auto"/>
+              <w:contextualSpacing/>
+              <w:rPr>
+                <w:rFonts w:ascii="Times New Roman" w:hAnsi="Times New Roman" w:cs="Times New Roman"/>
+                <w:sz w:val="26"/>
+                <w:szCs w:val="26"/>
+              </w:rPr>
+            </w:pPr>
+            <w:r>
+              <w:rPr>
+                <w:rFonts w:ascii="Times New Roman" w:hAnsi="Times New Roman" w:cs="Times New Roman"/>
+                <w:color w:val="1F1F1F"/>
+                <w:sz w:val="26"/>
+                <w:szCs w:val="26"/>
+                <w:bdr w:val="none" w:sz="0" w:space="0" w:color="auto" w:frame="1"/>
+              </w:rPr>
+              <w:t>Menu điều hướng</w:t>
+            </w:r>
+          </w:p>
+        </w:tc>
+        <w:tc>
+          <w:tcPr>
+            <w:tcW w:w="1786" w:type="dxa"/>
+            <w:gridSpan w:val="2"/>
+            <w:vAlign w:val="center"/>
+          </w:tcPr>
+          <w:p>
+            <w:pPr>
+              <w:spacing w:line="360" w:lineRule="auto"/>
+              <w:contextualSpacing/>
+              <w:rPr>
+                <w:rFonts w:ascii="Times New Roman" w:hAnsi="Times New Roman" w:cs="Times New Roman"/>
+                <w:sz w:val="26"/>
+                <w:szCs w:val="26"/>
+              </w:rPr>
+            </w:pPr>
+          </w:p>
+        </w:tc>
+        <w:tc>
+          <w:tcPr>
+            <w:tcW w:w="3138" w:type="dxa"/>
+            <w:gridSpan w:val="2"/>
+            <w:vAlign w:val="center"/>
+          </w:tcPr>
+          <w:p>
+            <w:pPr>
+              <w:spacing w:line="360" w:lineRule="auto"/>
+              <w:contextualSpacing/>
+              <w:rPr>
+                <w:rFonts w:ascii="Times New Roman" w:hAnsi="Times New Roman" w:cs="Times New Roman"/>
+                <w:sz w:val="26"/>
+                <w:szCs w:val="26"/>
+              </w:rPr>
+            </w:pPr>
+            <w:r>
+              <w:rPr>
+                <w:rFonts w:ascii="Times New Roman" w:hAnsi="Times New Roman" w:cs="Times New Roman"/>
+                <w:color w:val="1F1F1F"/>
+                <w:sz w:val="26"/>
+                <w:szCs w:val="26"/>
+                <w:bdr w:val="none" w:sz="0" w:space="0" w:color="auto" w:frame="1"/>
+              </w:rPr>
+              <w:t>Thanh menu sidebar, làm nổi bật mục "Phân công GV" đang được chọn.</w:t>
+            </w:r>
+          </w:p>
+        </w:tc>
+      </w:tr>
+      <w:tr>
+        <w:trPr>
+          <w:jc w:val="center"/>
+        </w:trPr>
+        <w:tc>
+          <w:tcPr>
+            <w:tcW w:w="1417" w:type="dxa"/>
+            <w:vAlign w:val="center"/>
+          </w:tcPr>
+          <w:p>
+            <w:pPr>
+              <w:spacing w:line="360" w:lineRule="auto"/>
+              <w:contextualSpacing/>
+              <w:rPr>
+                <w:rFonts w:ascii="Times New Roman" w:hAnsi="Times New Roman" w:cs="Times New Roman"/>
+                <w:sz w:val="26"/>
+                <w:szCs w:val="26"/>
+              </w:rPr>
+            </w:pPr>
+            <w:r>
+              <w:rPr>
+                <w:rFonts w:ascii="Times New Roman" w:hAnsi="Times New Roman" w:cs="Times New Roman"/>
+                <w:color w:val="1F1F1F"/>
+                <w:sz w:val="26"/>
+                <w:szCs w:val="26"/>
+                <w:bdr w:val="none" w:sz="0" w:space="0" w:color="auto" w:frame="1"/>
+              </w:rPr>
+              <w:t>2</w:t>
+            </w:r>
+          </w:p>
+        </w:tc>
+        <w:tc>
+          <w:tcPr>
+            <w:tcW w:w="2462" w:type="dxa"/>
+            <w:vAlign w:val="center"/>
+          </w:tcPr>
+          <w:p>
+            <w:pPr>
+              <w:spacing w:line="360" w:lineRule="auto"/>
+              <w:contextualSpacing/>
+              <w:rPr>
+                <w:rFonts w:ascii="Times New Roman" w:hAnsi="Times New Roman" w:cs="Times New Roman"/>
+                <w:sz w:val="26"/>
+                <w:szCs w:val="26"/>
+              </w:rPr>
+            </w:pPr>
+            <w:r>
+              <w:rPr>
+                <w:rFonts w:ascii="Times New Roman" w:hAnsi="Times New Roman" w:cs="Times New Roman"/>
+                <w:color w:val="1F1F1F"/>
+                <w:sz w:val="26"/>
+                <w:szCs w:val="26"/>
+                <w:bdr w:val="none" w:sz="0" w:space="0" w:color="auto" w:frame="1"/>
+              </w:rPr>
+              <w:t>Text</w:t>
+            </w:r>
+          </w:p>
+        </w:tc>
+        <w:tc>
+          <w:tcPr>
+            <w:tcW w:w="1786" w:type="dxa"/>
+            <w:gridSpan w:val="2"/>
+            <w:vAlign w:val="center"/>
+          </w:tcPr>
+          <w:p>
+            <w:pPr>
+              <w:spacing w:line="360" w:lineRule="auto"/>
+              <w:contextualSpacing/>
+              <w:rPr>
+                <w:rFonts w:ascii="Times New Roman" w:hAnsi="Times New Roman" w:cs="Times New Roman"/>
+                <w:sz w:val="26"/>
+                <w:szCs w:val="26"/>
+              </w:rPr>
+            </w:pPr>
+          </w:p>
+        </w:tc>
+        <w:tc>
+          <w:tcPr>
+            <w:tcW w:w="3138" w:type="dxa"/>
+            <w:gridSpan w:val="2"/>
+            <w:vAlign w:val="center"/>
+          </w:tcPr>
+          <w:p>
+            <w:pPr>
+              <w:spacing w:line="360" w:lineRule="auto"/>
+              <w:contextualSpacing/>
+              <w:rPr>
+                <w:rFonts w:ascii="Times New Roman" w:hAnsi="Times New Roman" w:cs="Times New Roman"/>
+                <w:sz w:val="26"/>
+                <w:szCs w:val="26"/>
+              </w:rPr>
+            </w:pPr>
+            <w:r>
+              <w:rPr>
+                <w:rFonts w:ascii="Times New Roman" w:hAnsi="Times New Roman" w:cs="Times New Roman"/>
+                <w:color w:val="1F1F1F"/>
+                <w:sz w:val="26"/>
+                <w:szCs w:val="26"/>
+                <w:bdr w:val="none" w:sz="0" w:space="0" w:color="auto" w:frame="1"/>
+              </w:rPr>
+              <w:t>Tiêu đề trang "Phân công giảng viên" và đường dẫn (Breadcrumb).</w:t>
+            </w:r>
+          </w:p>
+        </w:tc>
+      </w:tr>
+      <w:tr>
+        <w:trPr>
+          <w:jc w:val="center"/>
+        </w:trPr>
+        <w:tc>
+          <w:tcPr>
+            <w:tcW w:w="1417" w:type="dxa"/>
+            <w:vAlign w:val="center"/>
+          </w:tcPr>
+          <w:p>
+            <w:pPr>
+              <w:spacing w:line="360" w:lineRule="auto"/>
+              <w:contextualSpacing/>
+              <w:rPr>
+                <w:rFonts w:ascii="Times New Roman" w:hAnsi="Times New Roman" w:cs="Times New Roman"/>
+                <w:sz w:val="26"/>
+                <w:szCs w:val="26"/>
+              </w:rPr>
+            </w:pPr>
+            <w:r>
+              <w:rPr>
+                <w:rFonts w:ascii="Times New Roman" w:hAnsi="Times New Roman" w:cs="Times New Roman"/>
+                <w:color w:val="1F1F1F"/>
+                <w:sz w:val="26"/>
+                <w:szCs w:val="26"/>
+                <w:bdr w:val="none" w:sz="0" w:space="0" w:color="auto" w:frame="1"/>
+              </w:rPr>
+              <w:t>3</w:t>
+            </w:r>
+          </w:p>
+        </w:tc>
+        <w:tc>
+          <w:tcPr>
+            <w:tcW w:w="2462" w:type="dxa"/>
+            <w:vAlign w:val="center"/>
+          </w:tcPr>
+          <w:p>
+            <w:pPr>
+              <w:spacing w:line="360" w:lineRule="auto"/>
+              <w:contextualSpacing/>
+              <w:rPr>
+                <w:rFonts w:ascii="Times New Roman" w:hAnsi="Times New Roman" w:cs="Times New Roman"/>
+                <w:sz w:val="26"/>
+                <w:szCs w:val="26"/>
+              </w:rPr>
+            </w:pPr>
+            <w:r>
+              <w:rPr>
+                <w:rFonts w:ascii="Times New Roman" w:hAnsi="Times New Roman" w:cs="Times New Roman"/>
+                <w:color w:val="1F1F1F"/>
+                <w:sz w:val="26"/>
+                <w:szCs w:val="26"/>
+                <w:bdr w:val="none" w:sz="0" w:space="0" w:color="auto" w:frame="1"/>
+              </w:rPr>
+              <w:t>Button</w:t>
+            </w:r>
+          </w:p>
+        </w:tc>
+        <w:tc>
+          <w:tcPr>
+            <w:tcW w:w="1786" w:type="dxa"/>
+            <w:gridSpan w:val="2"/>
+            <w:vAlign w:val="center"/>
+          </w:tcPr>
+          <w:p>
+            <w:pPr>
+              <w:spacing w:line="360" w:lineRule="auto"/>
+              <w:contextualSpacing/>
+              <w:rPr>
+                <w:rFonts w:ascii="Times New Roman" w:hAnsi="Times New Roman" w:cs="Times New Roman"/>
+                <w:sz w:val="26"/>
+                <w:szCs w:val="26"/>
+              </w:rPr>
+            </w:pPr>
+          </w:p>
+        </w:tc>
+        <w:tc>
+          <w:tcPr>
+            <w:tcW w:w="3138" w:type="dxa"/>
+            <w:gridSpan w:val="2"/>
+            <w:vAlign w:val="center"/>
+          </w:tcPr>
+          <w:p>
+            <w:pPr>
+              <w:spacing w:line="360" w:lineRule="auto"/>
+              <w:contextualSpacing/>
+              <w:rPr>
+                <w:rFonts w:ascii="Times New Roman" w:hAnsi="Times New Roman" w:cs="Times New Roman"/>
+                <w:sz w:val="26"/>
+                <w:szCs w:val="26"/>
+              </w:rPr>
+            </w:pPr>
+            <w:r>
+              <w:rPr>
+                <w:rFonts w:ascii="Times New Roman" w:hAnsi="Times New Roman" w:cs="Times New Roman"/>
+                <w:color w:val="1F1F1F"/>
+                <w:sz w:val="26"/>
+                <w:szCs w:val="26"/>
+                <w:bdr w:val="none" w:sz="0" w:space="0" w:color="auto" w:frame="1"/>
+              </w:rPr>
+              <w:t>Nút "+ Phân công mới" để thêm nhanh một phân công.</w:t>
+            </w:r>
+          </w:p>
+        </w:tc>
+      </w:tr>
+      <w:tr>
+        <w:trPr>
+          <w:jc w:val="center"/>
+        </w:trPr>
+        <w:tc>
+          <w:tcPr>
+            <w:tcW w:w="1417" w:type="dxa"/>
+            <w:vAlign w:val="center"/>
+          </w:tcPr>
+          <w:p>
+            <w:pPr>
+              <w:spacing w:line="360" w:lineRule="auto"/>
+              <w:contextualSpacing/>
+              <w:rPr>
+                <w:rFonts w:ascii="Times New Roman" w:hAnsi="Times New Roman" w:cs="Times New Roman"/>
+                <w:sz w:val="26"/>
+                <w:szCs w:val="26"/>
+              </w:rPr>
+            </w:pPr>
+            <w:r>
+              <w:rPr>
+                <w:rFonts w:ascii="Times New Roman" w:hAnsi="Times New Roman" w:cs="Times New Roman"/>
+                <w:color w:val="1F1F1F"/>
+                <w:sz w:val="26"/>
+                <w:szCs w:val="26"/>
+                <w:bdr w:val="none" w:sz="0" w:space="0" w:color="auto" w:frame="1"/>
+              </w:rPr>
+              <w:t>4</w:t>
+            </w:r>
+          </w:p>
+        </w:tc>
+        <w:tc>
+          <w:tcPr>
+            <w:tcW w:w="2462" w:type="dxa"/>
+            <w:vAlign w:val="center"/>
+          </w:tcPr>
+          <w:p>
+            <w:pPr>
+              <w:spacing w:line="360" w:lineRule="auto"/>
+              <w:contextualSpacing/>
+              <w:rPr>
+                <w:rFonts w:ascii="Times New Roman" w:hAnsi="Times New Roman" w:cs="Times New Roman"/>
+                <w:sz w:val="26"/>
+                <w:szCs w:val="26"/>
+              </w:rPr>
+            </w:pPr>
+            <w:r>
+              <w:rPr>
+                <w:rFonts w:ascii="Times New Roman" w:hAnsi="Times New Roman" w:cs="Times New Roman"/>
+                <w:color w:val="1F1F1F"/>
+                <w:sz w:val="26"/>
+                <w:szCs w:val="26"/>
+                <w:bdr w:val="none" w:sz="0" w:space="0" w:color="auto" w:frame="1"/>
+              </w:rPr>
+              <w:t>Card (Thẻ thống kê)</w:t>
+            </w:r>
+          </w:p>
+        </w:tc>
+        <w:tc>
+          <w:tcPr>
+            <w:tcW w:w="1786" w:type="dxa"/>
+            <w:gridSpan w:val="2"/>
+            <w:vAlign w:val="center"/>
+          </w:tcPr>
+          <w:p>
+            <w:pPr>
+              <w:spacing w:line="360" w:lineRule="auto"/>
+              <w:contextualSpacing/>
+              <w:rPr>
+                <w:rFonts w:ascii="Times New Roman" w:hAnsi="Times New Roman" w:cs="Times New Roman"/>
+                <w:sz w:val="26"/>
+                <w:szCs w:val="26"/>
+              </w:rPr>
+            </w:pPr>
+          </w:p>
+        </w:tc>
+        <w:tc>
+          <w:tcPr>
+            <w:tcW w:w="3138" w:type="dxa"/>
+            <w:gridSpan w:val="2"/>
+            <w:vAlign w:val="center"/>
+          </w:tcPr>
+          <w:p>
+            <w:pPr>
+              <w:spacing w:line="360" w:lineRule="auto"/>
+              <w:contextualSpacing/>
+              <w:rPr>
+                <w:rFonts w:ascii="Times New Roman" w:hAnsi="Times New Roman" w:cs="Times New Roman"/>
+                <w:sz w:val="26"/>
+                <w:szCs w:val="26"/>
+              </w:rPr>
+            </w:pPr>
+            <w:r>
+              <w:rPr>
+                <w:rFonts w:ascii="Times New Roman" w:hAnsi="Times New Roman" w:cs="Times New Roman"/>
+                <w:color w:val="1F1F1F"/>
+                <w:sz w:val="26"/>
+                <w:szCs w:val="26"/>
+                <w:bdr w:val="none" w:sz="0" w:space="0" w:color="auto" w:frame="1"/>
+              </w:rPr>
+              <w:t>Các thẻ chứa số liệu tổng quan (Tổng giảng viên, Lớp đã phân công, GV quá tải, GV còn khả năng).</w:t>
+            </w:r>
+          </w:p>
+        </w:tc>
+      </w:tr>
+      <w:tr>
+        <w:trPr>
+          <w:jc w:val="center"/>
+        </w:trPr>
+        <w:tc>
+          <w:tcPr>
+            <w:tcW w:w="1417" w:type="dxa"/>
+            <w:vAlign w:val="center"/>
+          </w:tcPr>
+          <w:p>
+            <w:pPr>
+              <w:spacing w:line="360" w:lineRule="auto"/>
+              <w:contextualSpacing/>
+              <w:rPr>
+                <w:rFonts w:ascii="Times New Roman" w:hAnsi="Times New Roman" w:cs="Times New Roman"/>
+                <w:sz w:val="26"/>
+                <w:szCs w:val="26"/>
+              </w:rPr>
+            </w:pPr>
+            <w:r>
+              <w:rPr>
+                <w:rFonts w:ascii="Times New Roman" w:hAnsi="Times New Roman" w:cs="Times New Roman"/>
+                <w:color w:val="1F1F1F"/>
+                <w:sz w:val="26"/>
+                <w:szCs w:val="26"/>
+                <w:bdr w:val="none" w:sz="0" w:space="0" w:color="auto" w:frame="1"/>
+              </w:rPr>
+              <w:t>5</w:t>
+            </w:r>
+          </w:p>
+        </w:tc>
+        <w:tc>
+          <w:tcPr>
+            <w:tcW w:w="2462" w:type="dxa"/>
+            <w:vAlign w:val="center"/>
+          </w:tcPr>
+          <w:p>
+            <w:pPr>
+              <w:spacing w:line="360" w:lineRule="auto"/>
+              <w:contextualSpacing/>
+              <w:rPr>
+                <w:rFonts w:ascii="Times New Roman" w:hAnsi="Times New Roman" w:cs="Times New Roman"/>
+                <w:sz w:val="26"/>
+                <w:szCs w:val="26"/>
+              </w:rPr>
+            </w:pPr>
+            <w:r>
+              <w:rPr>
+                <w:rFonts w:ascii="Times New Roman" w:hAnsi="Times New Roman" w:cs="Times New Roman"/>
+                <w:color w:val="1F1F1F"/>
+                <w:sz w:val="26"/>
+                <w:szCs w:val="26"/>
+                <w:bdr w:val="none" w:sz="0" w:space="0" w:color="auto" w:frame="1"/>
+              </w:rPr>
+              <w:t>Search &amp; Combobox</w:t>
+            </w:r>
+          </w:p>
+        </w:tc>
+        <w:tc>
+          <w:tcPr>
+            <w:tcW w:w="1786" w:type="dxa"/>
+            <w:gridSpan w:val="2"/>
+            <w:vAlign w:val="center"/>
+          </w:tcPr>
+          <w:p>
+            <w:pPr>
+              <w:spacing w:line="360" w:lineRule="auto"/>
+              <w:contextualSpacing/>
+              <w:rPr>
+                <w:rFonts w:ascii="Times New Roman" w:hAnsi="Times New Roman" w:cs="Times New Roman"/>
+                <w:sz w:val="26"/>
+                <w:szCs w:val="26"/>
+              </w:rPr>
+            </w:pPr>
+          </w:p>
+        </w:tc>
+        <w:tc>
+          <w:tcPr>
+            <w:tcW w:w="3138" w:type="dxa"/>
+            <w:gridSpan w:val="2"/>
+            <w:vAlign w:val="center"/>
+          </w:tcPr>
+          <w:p>
+            <w:pPr>
+              <w:spacing w:line="360" w:lineRule="auto"/>
+              <w:contextualSpacing/>
+              <w:rPr>
+                <w:rFonts w:ascii="Times New Roman" w:hAnsi="Times New Roman" w:cs="Times New Roman"/>
+                <w:sz w:val="26"/>
+                <w:szCs w:val="26"/>
+              </w:rPr>
+            </w:pPr>
+            <w:r>
+              <w:rPr>
+                <w:rFonts w:ascii="Times New Roman" w:hAnsi="Times New Roman" w:cs="Times New Roman"/>
+                <w:color w:val="1F1F1F"/>
+                <w:sz w:val="26"/>
+                <w:szCs w:val="26"/>
+                <w:bdr w:val="none" w:sz="0" w:space="0" w:color="auto" w:frame="1"/>
+              </w:rPr>
+              <w:t>Thanh tìm kiếm giảng viên và Dropdown bộ lọc theo "Khoa/Bộ môn".</w:t>
+            </w:r>
+          </w:p>
+        </w:tc>
+      </w:tr>
+      <w:tr>
+        <w:trPr>
+          <w:jc w:val="center"/>
+        </w:trPr>
+        <w:tc>
+          <w:tcPr>
+            <w:tcW w:w="1417" w:type="dxa"/>
+            <w:vAlign w:val="center"/>
+          </w:tcPr>
+          <w:p>
+            <w:pPr>
+              <w:spacing w:line="360" w:lineRule="auto"/>
+              <w:contextualSpacing/>
+              <w:rPr>
+                <w:rFonts w:ascii="Times New Roman" w:hAnsi="Times New Roman" w:cs="Times New Roman"/>
+                <w:sz w:val="26"/>
+                <w:szCs w:val="26"/>
+              </w:rPr>
+            </w:pPr>
+            <w:r>
+              <w:rPr>
+                <w:rFonts w:ascii="Times New Roman" w:hAnsi="Times New Roman" w:cs="Times New Roman"/>
+                <w:color w:val="1F1F1F"/>
+                <w:sz w:val="26"/>
+                <w:szCs w:val="26"/>
+                <w:bdr w:val="none" w:sz="0" w:space="0" w:color="auto" w:frame="1"/>
+              </w:rPr>
+              <w:t>6</w:t>
+            </w:r>
+          </w:p>
+        </w:tc>
+        <w:tc>
+          <w:tcPr>
+            <w:tcW w:w="2462" w:type="dxa"/>
+            <w:vAlign w:val="center"/>
+          </w:tcPr>
+          <w:p>
+            <w:pPr>
+              <w:spacing w:line="360" w:lineRule="auto"/>
+              <w:contextualSpacing/>
+              <w:rPr>
+                <w:rFonts w:ascii="Times New Roman" w:hAnsi="Times New Roman" w:cs="Times New Roman"/>
+                <w:sz w:val="26"/>
+                <w:szCs w:val="26"/>
+              </w:rPr>
+            </w:pPr>
+            <w:r>
+              <w:rPr>
+                <w:rFonts w:ascii="Times New Roman" w:hAnsi="Times New Roman" w:cs="Times New Roman"/>
+                <w:color w:val="1F1F1F"/>
+                <w:sz w:val="26"/>
+                <w:szCs w:val="26"/>
+                <w:bdr w:val="none" w:sz="0" w:space="0" w:color="auto" w:frame="1"/>
+              </w:rPr>
+              <w:t>Card (Thẻ thông tin)</w:t>
+            </w:r>
+          </w:p>
+        </w:tc>
+        <w:tc>
+          <w:tcPr>
+            <w:tcW w:w="1786" w:type="dxa"/>
+            <w:gridSpan w:val="2"/>
+            <w:vAlign w:val="center"/>
+          </w:tcPr>
+          <w:p>
+            <w:pPr>
+              <w:spacing w:line="360" w:lineRule="auto"/>
+              <w:contextualSpacing/>
+              <w:rPr>
+                <w:rFonts w:ascii="Times New Roman" w:hAnsi="Times New Roman" w:cs="Times New Roman"/>
+                <w:sz w:val="26"/>
+                <w:szCs w:val="26"/>
+              </w:rPr>
+            </w:pPr>
+          </w:p>
+        </w:tc>
+        <w:tc>
+          <w:tcPr>
+            <w:tcW w:w="3138" w:type="dxa"/>
+            <w:gridSpan w:val="2"/>
+            <w:vAlign w:val="center"/>
+          </w:tcPr>
+          <w:p>
+            <w:pPr>
+              <w:spacing w:line="360" w:lineRule="auto"/>
+              <w:contextualSpacing/>
+              <w:rPr>
+                <w:rFonts w:ascii="Times New Roman" w:hAnsi="Times New Roman" w:cs="Times New Roman"/>
+                <w:sz w:val="26"/>
+                <w:szCs w:val="26"/>
+              </w:rPr>
+            </w:pPr>
+            <w:r>
+              <w:rPr>
+                <w:rFonts w:ascii="Times New Roman" w:hAnsi="Times New Roman" w:cs="Times New Roman"/>
+                <w:color w:val="1F1F1F"/>
+                <w:sz w:val="26"/>
+                <w:szCs w:val="26"/>
+                <w:bdr w:val="none" w:sz="0" w:space="0" w:color="auto" w:frame="1"/>
+              </w:rPr>
+              <w:t>Thẻ hiển thị thông tin GV, tiến độ tải giảng dạy, danh sách lớp đã phân công và nút thao tác.</w:t>
+            </w:r>
+          </w:p>
+        </w:tc>
+      </w:tr>
+      <w:tr>
+        <w:trPr>
+          <w:jc w:val="center"/>
+        </w:trPr>
+        <w:tc>
+          <w:tcPr>
+            <w:tcW w:w="1417" w:type="dxa"/>
+            <w:vAlign w:val="center"/>
+          </w:tcPr>
+          <w:p>
+            <w:pPr>
+              <w:spacing w:line="360" w:lineRule="auto"/>
+              <w:contextualSpacing/>
+              <w:rPr>
+                <w:rFonts w:ascii="Times New Roman" w:hAnsi="Times New Roman" w:cs="Times New Roman"/>
+                <w:sz w:val="26"/>
+                <w:szCs w:val="26"/>
+              </w:rPr>
+            </w:pPr>
+            <w:r>
+              <w:rPr>
+                <w:rFonts w:ascii="Times New Roman" w:hAnsi="Times New Roman" w:cs="Times New Roman"/>
+                <w:color w:val="1F1F1F"/>
+                <w:sz w:val="26"/>
+                <w:szCs w:val="26"/>
+                <w:bdr w:val="none" w:sz="0" w:space="0" w:color="auto" w:frame="1"/>
+              </w:rPr>
+              <w:t>7</w:t>
+            </w:r>
+          </w:p>
+        </w:tc>
+        <w:tc>
+          <w:tcPr>
+            <w:tcW w:w="2462" w:type="dxa"/>
+            <w:vAlign w:val="center"/>
+          </w:tcPr>
+          <w:p>
+            <w:pPr>
+              <w:spacing w:line="360" w:lineRule="auto"/>
+              <w:contextualSpacing/>
+              <w:rPr>
+                <w:rFonts w:ascii="Times New Roman" w:hAnsi="Times New Roman" w:cs="Times New Roman"/>
+                <w:sz w:val="26"/>
+                <w:szCs w:val="26"/>
+              </w:rPr>
+            </w:pPr>
+            <w:r>
+              <w:rPr>
+                <w:rFonts w:ascii="Times New Roman" w:hAnsi="Times New Roman" w:cs="Times New Roman"/>
+                <w:color w:val="1F1F1F"/>
+                <w:sz w:val="26"/>
+                <w:szCs w:val="26"/>
+                <w:bdr w:val="none" w:sz="0" w:space="0" w:color="auto" w:frame="1"/>
+              </w:rPr>
+              <w:t>Card (Thẻ thông tin)</w:t>
+            </w:r>
+          </w:p>
+        </w:tc>
+        <w:tc>
+          <w:tcPr>
+            <w:tcW w:w="1786" w:type="dxa"/>
+            <w:gridSpan w:val="2"/>
+            <w:vAlign w:val="center"/>
+          </w:tcPr>
+          <w:p>
+            <w:pPr>
+              <w:spacing w:line="360" w:lineRule="auto"/>
+              <w:contextualSpacing/>
+              <w:rPr>
+                <w:rFonts w:ascii="Times New Roman" w:hAnsi="Times New Roman" w:cs="Times New Roman"/>
+                <w:sz w:val="26"/>
+                <w:szCs w:val="26"/>
+              </w:rPr>
+            </w:pPr>
+          </w:p>
+        </w:tc>
+        <w:tc>
+          <w:tcPr>
+            <w:tcW w:w="3138" w:type="dxa"/>
+            <w:gridSpan w:val="2"/>
+            <w:vAlign w:val="center"/>
+          </w:tcPr>
+          <w:p>
+            <w:pPr>
+              <w:spacing w:line="360" w:lineRule="auto"/>
+              <w:contextualSpacing/>
+              <w:rPr>
+                <w:rFonts w:ascii="Times New Roman" w:hAnsi="Times New Roman" w:cs="Times New Roman"/>
+                <w:sz w:val="26"/>
+                <w:szCs w:val="26"/>
+              </w:rPr>
+            </w:pPr>
+            <w:r>
+              <w:rPr>
+                <w:rFonts w:ascii="Times New Roman" w:hAnsi="Times New Roman" w:cs="Times New Roman"/>
+                <w:color w:val="1F1F1F"/>
+                <w:sz w:val="26"/>
+                <w:szCs w:val="26"/>
+                <w:bdr w:val="none" w:sz="0" w:space="0" w:color="auto" w:frame="1"/>
+              </w:rPr>
+              <w:t>Thẻ hiển thị thông tin của một giảng viên khác tương tự mục số 6.</w:t>
+            </w:r>
+          </w:p>
+        </w:tc>
+      </w:tr>
+      <w:tr>
+        <w:trPr>
+          <w:jc w:val="center"/>
+        </w:trPr>
+        <w:tc>
+          <w:tcPr>
+            <w:tcW w:w="1417" w:type="dxa"/>
+            <w:vAlign w:val="center"/>
+          </w:tcPr>
+          <w:p>
+            <w:pPr>
+              <w:spacing w:line="360" w:lineRule="auto"/>
+              <w:contextualSpacing/>
+              <w:rPr>
+                <w:rFonts w:ascii="Times New Roman" w:hAnsi="Times New Roman" w:cs="Times New Roman"/>
+                <w:sz w:val="26"/>
+                <w:szCs w:val="26"/>
+              </w:rPr>
+            </w:pPr>
+            <w:r>
+              <w:rPr>
+                <w:rFonts w:ascii="Times New Roman" w:hAnsi="Times New Roman" w:cs="Times New Roman"/>
+                <w:color w:val="1F1F1F"/>
+                <w:sz w:val="26"/>
+                <w:szCs w:val="26"/>
+                <w:bdr w:val="none" w:sz="0" w:space="0" w:color="auto" w:frame="1"/>
+              </w:rPr>
+              <w:t>8</w:t>
+            </w:r>
+          </w:p>
+        </w:tc>
+        <w:tc>
+          <w:tcPr>
+            <w:tcW w:w="2462" w:type="dxa"/>
+            <w:vAlign w:val="center"/>
+          </w:tcPr>
+          <w:p>
+            <w:pPr>
+              <w:spacing w:line="360" w:lineRule="auto"/>
+              <w:contextualSpacing/>
+              <w:rPr>
+                <w:rFonts w:ascii="Times New Roman" w:hAnsi="Times New Roman" w:cs="Times New Roman"/>
+                <w:sz w:val="26"/>
+                <w:szCs w:val="26"/>
+              </w:rPr>
+            </w:pPr>
+            <w:r>
+              <w:rPr>
+                <w:rFonts w:ascii="Times New Roman" w:hAnsi="Times New Roman" w:cs="Times New Roman"/>
+                <w:color w:val="1F1F1F"/>
+                <w:sz w:val="26"/>
+                <w:szCs w:val="26"/>
+                <w:bdr w:val="none" w:sz="0" w:space="0" w:color="auto" w:frame="1"/>
+              </w:rPr>
+              <w:t>Card (Thẻ thông tin)</w:t>
+            </w:r>
+          </w:p>
+        </w:tc>
+        <w:tc>
+          <w:tcPr>
+            <w:tcW w:w="1786" w:type="dxa"/>
+            <w:gridSpan w:val="2"/>
+            <w:vAlign w:val="center"/>
+          </w:tcPr>
+          <w:p>
+            <w:pPr>
+              <w:spacing w:line="360" w:lineRule="auto"/>
+              <w:contextualSpacing/>
+              <w:rPr>
+                <w:rFonts w:ascii="Times New Roman" w:hAnsi="Times New Roman" w:cs="Times New Roman"/>
+                <w:sz w:val="26"/>
+                <w:szCs w:val="26"/>
+              </w:rPr>
+            </w:pPr>
+          </w:p>
+        </w:tc>
+        <w:tc>
+          <w:tcPr>
+            <w:tcW w:w="3138" w:type="dxa"/>
+            <w:gridSpan w:val="2"/>
+            <w:vAlign w:val="center"/>
+          </w:tcPr>
+          <w:p>
+            <w:pPr>
+              <w:spacing w:line="360" w:lineRule="auto"/>
+              <w:contextualSpacing/>
+              <w:rPr>
+                <w:rFonts w:ascii="Times New Roman" w:hAnsi="Times New Roman" w:cs="Times New Roman"/>
+                <w:sz w:val="26"/>
+                <w:szCs w:val="26"/>
+              </w:rPr>
+            </w:pPr>
+            <w:r>
+              <w:rPr>
+                <w:rFonts w:ascii="Times New Roman" w:hAnsi="Times New Roman" w:cs="Times New Roman"/>
+                <w:color w:val="1F1F1F"/>
+                <w:sz w:val="26"/>
+                <w:szCs w:val="26"/>
+                <w:bdr w:val="none" w:sz="0" w:space="0" w:color="auto" w:frame="1"/>
+              </w:rPr>
+              <w:t>Thẻ của giảng viên đang có trạng thái "Quá tải" (chỉ có nút "Xem tất cả", ẩn nút phân công thêm).</w:t>
+            </w:r>
+          </w:p>
+        </w:tc>
+      </w:tr>
+      <w:tr>
+        <w:trPr>
+          <w:jc w:val="center"/>
+        </w:trPr>
+        <w:tc>
+          <w:tcPr>
+            <w:tcW w:w="1417" w:type="dxa"/>
+            <w:vAlign w:val="center"/>
+          </w:tcPr>
+          <w:p>
+            <w:pPr>
+              <w:spacing w:line="360" w:lineRule="auto"/>
+              <w:contextualSpacing/>
+              <w:rPr>
+                <w:rFonts w:ascii="Times New Roman" w:hAnsi="Times New Roman" w:cs="Times New Roman"/>
+                <w:sz w:val="26"/>
+                <w:szCs w:val="26"/>
+              </w:rPr>
+            </w:pPr>
+            <w:r>
+              <w:rPr>
+                <w:rFonts w:ascii="Times New Roman" w:hAnsi="Times New Roman" w:cs="Times New Roman"/>
+                <w:color w:val="1F1F1F"/>
+                <w:sz w:val="26"/>
+                <w:szCs w:val="26"/>
+                <w:bdr w:val="none" w:sz="0" w:space="0" w:color="auto" w:frame="1"/>
+              </w:rPr>
+              <w:t>9</w:t>
+            </w:r>
+          </w:p>
+        </w:tc>
+        <w:tc>
+          <w:tcPr>
+            <w:tcW w:w="2462" w:type="dxa"/>
+            <w:vAlign w:val="center"/>
+          </w:tcPr>
+          <w:p>
+            <w:pPr>
+              <w:spacing w:line="360" w:lineRule="auto"/>
+              <w:contextualSpacing/>
+              <w:rPr>
+                <w:rFonts w:ascii="Times New Roman" w:hAnsi="Times New Roman" w:cs="Times New Roman"/>
+                <w:sz w:val="26"/>
+                <w:szCs w:val="26"/>
+              </w:rPr>
+            </w:pPr>
+            <w:r>
+              <w:rPr>
+                <w:rFonts w:ascii="Times New Roman" w:hAnsi="Times New Roman" w:cs="Times New Roman"/>
+                <w:color w:val="1F1F1F"/>
+                <w:sz w:val="26"/>
+                <w:szCs w:val="26"/>
+                <w:bdr w:val="none" w:sz="0" w:space="0" w:color="auto" w:frame="1"/>
+              </w:rPr>
+              <w:t>Card (Thẻ thông tin)</w:t>
+            </w:r>
+          </w:p>
+        </w:tc>
+        <w:tc>
+          <w:tcPr>
+            <w:tcW w:w="1786" w:type="dxa"/>
+            <w:gridSpan w:val="2"/>
+            <w:vAlign w:val="center"/>
+          </w:tcPr>
+          <w:p>
+            <w:pPr>
+              <w:spacing w:line="360" w:lineRule="auto"/>
+              <w:contextualSpacing/>
+              <w:rPr>
+                <w:rFonts w:ascii="Times New Roman" w:hAnsi="Times New Roman" w:cs="Times New Roman"/>
+                <w:sz w:val="26"/>
+                <w:szCs w:val="26"/>
+              </w:rPr>
+            </w:pPr>
+          </w:p>
+        </w:tc>
+        <w:tc>
+          <w:tcPr>
+            <w:tcW w:w="3138" w:type="dxa"/>
+            <w:gridSpan w:val="2"/>
+            <w:vAlign w:val="center"/>
+          </w:tcPr>
+          <w:p>
+            <w:pPr>
+              <w:spacing w:line="360" w:lineRule="auto"/>
+              <w:contextualSpacing/>
+              <w:rPr>
+                <w:rFonts w:ascii="Times New Roman" w:hAnsi="Times New Roman" w:cs="Times New Roman"/>
+                <w:sz w:val="26"/>
+                <w:szCs w:val="26"/>
+              </w:rPr>
+            </w:pPr>
+            <w:r>
+              <w:rPr>
+                <w:rFonts w:ascii="Times New Roman" w:hAnsi="Times New Roman" w:cs="Times New Roman"/>
+                <w:color w:val="1F1F1F"/>
+                <w:sz w:val="26"/>
+                <w:szCs w:val="26"/>
+                <w:bdr w:val="none" w:sz="0" w:space="0" w:color="auto" w:frame="1"/>
+              </w:rPr>
+              <w:t>Thẻ của giảng viên chưa được phân công lớp nào (hiển thị trạng thái trống).</w:t>
+            </w:r>
+          </w:p>
+        </w:tc>
+      </w:tr>
+      <w:tr>
+        <w:trPr>
+          <w:jc w:val="center"/>
+        </w:trPr>
+        <w:tc>
+          <w:tcPr>
+            <w:tcW w:w="8803" w:type="dxa"/>
+            <w:gridSpan w:val="6"/>
+          </w:tcPr>
+          <w:p>
+            <w:pPr>
+              <w:spacing w:line="360" w:lineRule="auto"/>
+              <w:contextualSpacing/>
+              <w:rPr>
+                <w:rFonts w:ascii="Times New Roman" w:hAnsi="Times New Roman" w:cs="Times New Roman"/>
+                <w:b/>
+                <w:sz w:val="26"/>
+                <w:szCs w:val="26"/>
+              </w:rPr>
+            </w:pPr>
+            <w:r>
+              <w:rPr>
+                <w:rFonts w:ascii="Times New Roman" w:hAnsi="Times New Roman" w:cs="Times New Roman"/>
+                <w:b/>
+                <w:sz w:val="26"/>
+                <w:szCs w:val="26"/>
+              </w:rPr>
+              <w:t>Hoạt động</w:t>
+            </w:r>
+          </w:p>
+        </w:tc>
+      </w:tr>
+      <w:tr>
+        <w:trPr>
+          <w:jc w:val="center"/>
+        </w:trPr>
+        <w:tc>
+          <w:tcPr>
+            <w:tcW w:w="1417" w:type="dxa"/>
+            <w:shd w:val="clear" w:color="auto" w:fill="C1E4F5" w:themeFill="accent1" w:themeFillTint="33"/>
+            <w:vAlign w:val="center"/>
+          </w:tcPr>
+          <w:p>
+            <w:pPr>
+              <w:spacing w:line="360" w:lineRule="auto"/>
+              <w:contextualSpacing/>
+              <w:rPr>
+                <w:rFonts w:ascii="Times New Roman" w:hAnsi="Times New Roman" w:cs="Times New Roman"/>
+                <w:b/>
+                <w:sz w:val="26"/>
+                <w:szCs w:val="26"/>
+              </w:rPr>
+            </w:pPr>
+            <w:r>
+              <w:rPr>
+                <w:rStyle w:val="Strong"/>
+                <w:rFonts w:ascii="Times New Roman" w:hAnsi="Times New Roman" w:cs="Times New Roman"/>
+                <w:color w:val="1F1F1F"/>
+                <w:sz w:val="26"/>
+                <w:szCs w:val="26"/>
+                <w:bdr w:val="none" w:sz="0" w:space="0" w:color="auto" w:frame="1"/>
+              </w:rPr>
+              <w:lastRenderedPageBreak/>
+              <w:t>Tên</w:t>
+            </w:r>
+          </w:p>
+        </w:tc>
+        <w:tc>
+          <w:tcPr>
+            <w:tcW w:w="2689" w:type="dxa"/>
+            <w:gridSpan w:val="2"/>
+            <w:shd w:val="clear" w:color="auto" w:fill="C1E4F5" w:themeFill="accent1" w:themeFillTint="33"/>
+            <w:vAlign w:val="center"/>
+          </w:tcPr>
+          <w:p>
+            <w:pPr>
+              <w:spacing w:line="360" w:lineRule="auto"/>
+              <w:contextualSpacing/>
+              <w:rPr>
+                <w:rFonts w:ascii="Times New Roman" w:hAnsi="Times New Roman" w:cs="Times New Roman"/>
+                <w:b/>
+                <w:sz w:val="26"/>
+                <w:szCs w:val="26"/>
+              </w:rPr>
+            </w:pPr>
+            <w:r>
+              <w:rPr>
+                <w:rStyle w:val="Strong"/>
+                <w:rFonts w:ascii="Times New Roman" w:hAnsi="Times New Roman" w:cs="Times New Roman"/>
+                <w:color w:val="1F1F1F"/>
+                <w:sz w:val="26"/>
+                <w:szCs w:val="26"/>
+                <w:bdr w:val="none" w:sz="0" w:space="0" w:color="auto" w:frame="1"/>
+              </w:rPr>
+              <w:t>Mô tả</w:t>
+            </w:r>
+          </w:p>
+        </w:tc>
+        <w:tc>
+          <w:tcPr>
+            <w:tcW w:w="2850" w:type="dxa"/>
+            <w:gridSpan w:val="2"/>
+            <w:shd w:val="clear" w:color="auto" w:fill="C1E4F5" w:themeFill="accent1" w:themeFillTint="33"/>
+            <w:vAlign w:val="center"/>
+          </w:tcPr>
+          <w:p>
+            <w:pPr>
+              <w:spacing w:line="360" w:lineRule="auto"/>
+              <w:contextualSpacing/>
+              <w:rPr>
+                <w:rFonts w:ascii="Times New Roman" w:hAnsi="Times New Roman" w:cs="Times New Roman"/>
+                <w:b/>
+                <w:sz w:val="26"/>
+                <w:szCs w:val="26"/>
+              </w:rPr>
+            </w:pPr>
+            <w:r>
+              <w:rPr>
+                <w:rStyle w:val="Strong"/>
+                <w:rFonts w:ascii="Times New Roman" w:hAnsi="Times New Roman" w:cs="Times New Roman"/>
+                <w:color w:val="1F1F1F"/>
+                <w:sz w:val="26"/>
+                <w:szCs w:val="26"/>
+                <w:bdr w:val="none" w:sz="0" w:space="0" w:color="auto" w:frame="1"/>
+              </w:rPr>
+              <w:t>Thành công</w:t>
+            </w:r>
+          </w:p>
+        </w:tc>
+        <w:tc>
+          <w:tcPr>
+            <w:tcW w:w="1847" w:type="dxa"/>
+            <w:shd w:val="clear" w:color="auto" w:fill="C1E4F5" w:themeFill="accent1" w:themeFillTint="33"/>
+            <w:vAlign w:val="center"/>
+          </w:tcPr>
+          <w:p>
+            <w:pPr>
+              <w:spacing w:line="360" w:lineRule="auto"/>
+              <w:contextualSpacing/>
+              <w:rPr>
+                <w:rFonts w:ascii="Times New Roman" w:hAnsi="Times New Roman" w:cs="Times New Roman"/>
+                <w:b/>
+                <w:sz w:val="26"/>
+                <w:szCs w:val="26"/>
+              </w:rPr>
+            </w:pPr>
+            <w:r>
+              <w:rPr>
+                <w:rStyle w:val="Strong"/>
+                <w:rFonts w:ascii="Times New Roman" w:hAnsi="Times New Roman" w:cs="Times New Roman"/>
+                <w:color w:val="1F1F1F"/>
+                <w:sz w:val="26"/>
+                <w:szCs w:val="26"/>
+                <w:bdr w:val="none" w:sz="0" w:space="0" w:color="auto" w:frame="1"/>
+              </w:rPr>
+              <w:t>Thất bại</w:t>
+            </w:r>
+          </w:p>
+        </w:tc>
+      </w:tr>
+      <w:tr>
+        <w:trPr>
+          <w:jc w:val="center"/>
+        </w:trPr>
+        <w:tc>
+          <w:tcPr>
+            <w:tcW w:w="1417" w:type="dxa"/>
+            <w:vAlign w:val="center"/>
+          </w:tcPr>
+          <w:p>
+            <w:pPr>
+              <w:spacing w:line="360" w:lineRule="auto"/>
+              <w:contextualSpacing/>
+              <w:rPr>
+                <w:rFonts w:ascii="Times New Roman" w:hAnsi="Times New Roman" w:cs="Times New Roman"/>
+                <w:sz w:val="26"/>
+                <w:szCs w:val="26"/>
+              </w:rPr>
+            </w:pPr>
+            <w:r>
+              <w:rPr>
+                <w:rFonts w:ascii="Times New Roman" w:hAnsi="Times New Roman" w:cs="Times New Roman"/>
+                <w:color w:val="1F1F1F"/>
+                <w:sz w:val="26"/>
+                <w:szCs w:val="26"/>
+                <w:bdr w:val="none" w:sz="0" w:space="0" w:color="auto" w:frame="1"/>
+              </w:rPr>
+              <w:t>Thêm phân công</w:t>
+            </w:r>
+          </w:p>
+        </w:tc>
+        <w:tc>
+          <w:tcPr>
+            <w:tcW w:w="2689" w:type="dxa"/>
+            <w:gridSpan w:val="2"/>
+            <w:vAlign w:val="center"/>
+          </w:tcPr>
+          <w:p>
+            <w:pPr>
+              <w:spacing w:line="360" w:lineRule="auto"/>
+              <w:contextualSpacing/>
+              <w:rPr>
+                <w:rFonts w:ascii="Times New Roman" w:hAnsi="Times New Roman" w:cs="Times New Roman"/>
+                <w:sz w:val="26"/>
+                <w:szCs w:val="26"/>
+              </w:rPr>
+            </w:pPr>
+            <w:r>
+              <w:rPr>
+                <w:rFonts w:ascii="Times New Roman" w:hAnsi="Times New Roman" w:cs="Times New Roman"/>
+                <w:color w:val="1F1F1F"/>
+                <w:sz w:val="26"/>
+                <w:szCs w:val="26"/>
+                <w:bdr w:val="none" w:sz="0" w:space="0" w:color="auto" w:frame="1"/>
+              </w:rPr>
+              <w:t>Nhấn nút "+ Phân công mới" hoặc "+ Phân công" trên thẻ GV</w:t>
+            </w:r>
+          </w:p>
+        </w:tc>
+        <w:tc>
+          <w:tcPr>
+            <w:tcW w:w="2850" w:type="dxa"/>
+            <w:gridSpan w:val="2"/>
+            <w:vAlign w:val="center"/>
+          </w:tcPr>
+          <w:p>
+            <w:pPr>
+              <w:spacing w:line="360" w:lineRule="auto"/>
+              <w:contextualSpacing/>
+              <w:rPr>
+                <w:rFonts w:ascii="Times New Roman" w:hAnsi="Times New Roman" w:cs="Times New Roman"/>
+                <w:sz w:val="26"/>
+                <w:szCs w:val="26"/>
+              </w:rPr>
+            </w:pPr>
+            <w:r>
+              <w:rPr>
+                <w:rFonts w:ascii="Times New Roman" w:hAnsi="Times New Roman" w:cs="Times New Roman"/>
+                <w:color w:val="1F1F1F"/>
+                <w:sz w:val="26"/>
+                <w:szCs w:val="26"/>
+                <w:bdr w:val="none" w:sz="0" w:space="0" w:color="auto" w:frame="1"/>
+              </w:rPr>
+              <w:t>Mở cửa sổ/giao diện phân công lớp học cho giảng viên</w:t>
+            </w:r>
+          </w:p>
+        </w:tc>
+        <w:tc>
+          <w:tcPr>
+            <w:tcW w:w="1847" w:type="dxa"/>
+            <w:vAlign w:val="center"/>
+          </w:tcPr>
+          <w:p>
+            <w:pPr>
+              <w:spacing w:line="360" w:lineRule="auto"/>
+              <w:contextualSpacing/>
+              <w:rPr>
+                <w:rFonts w:ascii="Times New Roman" w:hAnsi="Times New Roman" w:cs="Times New Roman"/>
+                <w:sz w:val="26"/>
+                <w:szCs w:val="26"/>
+              </w:rPr>
+            </w:pPr>
+            <w:r>
+              <w:rPr>
+                <w:rFonts w:ascii="Times New Roman" w:hAnsi="Times New Roman" w:cs="Times New Roman"/>
+                <w:color w:val="1F1F1F"/>
+                <w:sz w:val="26"/>
+                <w:szCs w:val="26"/>
+                <w:bdr w:val="none" w:sz="0" w:space="0" w:color="auto" w:frame="1"/>
+              </w:rPr>
+              <w:t>Hệ thống báo lỗi, không mở được giao diện</w:t>
+            </w:r>
+          </w:p>
+        </w:tc>
+      </w:tr>
+      <w:tr>
+        <w:trPr>
+          <w:jc w:val="center"/>
+        </w:trPr>
+        <w:tc>
+          <w:tcPr>
+            <w:tcW w:w="1417" w:type="dxa"/>
+            <w:vAlign w:val="center"/>
+          </w:tcPr>
+          <w:p>
+            <w:pPr>
+              <w:spacing w:line="360" w:lineRule="auto"/>
+              <w:contextualSpacing/>
+              <w:rPr>
+                <w:rFonts w:ascii="Times New Roman" w:hAnsi="Times New Roman" w:cs="Times New Roman"/>
+                <w:sz w:val="26"/>
+                <w:szCs w:val="26"/>
+              </w:rPr>
+            </w:pPr>
+            <w:r>
+              <w:rPr>
+                <w:rFonts w:ascii="Times New Roman" w:hAnsi="Times New Roman" w:cs="Times New Roman"/>
+                <w:color w:val="1F1F1F"/>
+                <w:sz w:val="26"/>
+                <w:szCs w:val="26"/>
+                <w:bdr w:val="none" w:sz="0" w:space="0" w:color="auto" w:frame="1"/>
+              </w:rPr>
+              <w:t>Tìm kiếm</w:t>
+            </w:r>
+          </w:p>
+        </w:tc>
+        <w:tc>
+          <w:tcPr>
+            <w:tcW w:w="2689" w:type="dxa"/>
+            <w:gridSpan w:val="2"/>
+            <w:vAlign w:val="center"/>
+          </w:tcPr>
+          <w:p>
+            <w:pPr>
+              <w:spacing w:line="360" w:lineRule="auto"/>
+              <w:contextualSpacing/>
+              <w:rPr>
+                <w:rFonts w:ascii="Times New Roman" w:hAnsi="Times New Roman" w:cs="Times New Roman"/>
+                <w:sz w:val="26"/>
+                <w:szCs w:val="26"/>
+              </w:rPr>
+            </w:pPr>
+            <w:r>
+              <w:rPr>
+                <w:rFonts w:ascii="Times New Roman" w:hAnsi="Times New Roman" w:cs="Times New Roman"/>
+                <w:color w:val="1F1F1F"/>
+                <w:sz w:val="26"/>
+                <w:szCs w:val="26"/>
+                <w:bdr w:val="none" w:sz="0" w:space="0" w:color="auto" w:frame="1"/>
+              </w:rPr>
+              <w:t>Nhập từ khóa vào thanh tìm kiếm</w:t>
+            </w:r>
+          </w:p>
+        </w:tc>
+        <w:tc>
+          <w:tcPr>
+            <w:tcW w:w="2850" w:type="dxa"/>
+            <w:gridSpan w:val="2"/>
+            <w:vAlign w:val="center"/>
+          </w:tcPr>
+          <w:p>
+            <w:pPr>
+              <w:spacing w:line="360" w:lineRule="auto"/>
+              <w:contextualSpacing/>
+              <w:rPr>
+                <w:rFonts w:ascii="Times New Roman" w:hAnsi="Times New Roman" w:cs="Times New Roman"/>
+                <w:sz w:val="26"/>
+                <w:szCs w:val="26"/>
+              </w:rPr>
+            </w:pPr>
+            <w:r>
+              <w:rPr>
+                <w:rFonts w:ascii="Times New Roman" w:hAnsi="Times New Roman" w:cs="Times New Roman"/>
+                <w:color w:val="1F1F1F"/>
+                <w:sz w:val="26"/>
+                <w:szCs w:val="26"/>
+                <w:bdr w:val="none" w:sz="0" w:space="0" w:color="auto" w:frame="1"/>
+              </w:rPr>
+              <w:t>Lọc và hiển thị danh sách GV khớp với từ khóa</w:t>
+            </w:r>
+          </w:p>
+        </w:tc>
+        <w:tc>
+          <w:tcPr>
+            <w:tcW w:w="1847" w:type="dxa"/>
+            <w:vAlign w:val="center"/>
+          </w:tcPr>
+          <w:p>
+            <w:pPr>
+              <w:spacing w:line="360" w:lineRule="auto"/>
+              <w:contextualSpacing/>
+              <w:rPr>
+                <w:rFonts w:ascii="Times New Roman" w:hAnsi="Times New Roman" w:cs="Times New Roman"/>
+                <w:sz w:val="26"/>
+                <w:szCs w:val="26"/>
+              </w:rPr>
+            </w:pPr>
+            <w:r>
+              <w:rPr>
+                <w:rFonts w:ascii="Times New Roman" w:hAnsi="Times New Roman" w:cs="Times New Roman"/>
+                <w:color w:val="1F1F1F"/>
+                <w:sz w:val="26"/>
+                <w:szCs w:val="26"/>
+                <w:bdr w:val="none" w:sz="0" w:space="0" w:color="auto" w:frame="1"/>
+              </w:rPr>
+              <w:t>Báo "Không tìm thấy kết quả" nếu không có</w:t>
+            </w:r>
+          </w:p>
+        </w:tc>
+      </w:tr>
+      <w:tr>
+        <w:trPr>
+          <w:jc w:val="center"/>
+        </w:trPr>
+        <w:tc>
+          <w:tcPr>
+            <w:tcW w:w="1417" w:type="dxa"/>
+            <w:vAlign w:val="center"/>
+          </w:tcPr>
+          <w:p>
+            <w:pPr>
+              <w:spacing w:line="360" w:lineRule="auto"/>
+              <w:contextualSpacing/>
+              <w:rPr>
+                <w:rFonts w:ascii="Times New Roman" w:hAnsi="Times New Roman" w:cs="Times New Roman"/>
+                <w:sz w:val="26"/>
+                <w:szCs w:val="26"/>
+              </w:rPr>
+            </w:pPr>
+            <w:r>
+              <w:rPr>
+                <w:rFonts w:ascii="Times New Roman" w:hAnsi="Times New Roman" w:cs="Times New Roman"/>
+                <w:color w:val="1F1F1F"/>
+                <w:sz w:val="26"/>
+                <w:szCs w:val="26"/>
+                <w:bdr w:val="none" w:sz="0" w:space="0" w:color="auto" w:frame="1"/>
+              </w:rPr>
+              <w:t>Lọc theo khoa</w:t>
+            </w:r>
+          </w:p>
+        </w:tc>
+        <w:tc>
+          <w:tcPr>
+            <w:tcW w:w="2689" w:type="dxa"/>
+            <w:gridSpan w:val="2"/>
+            <w:vAlign w:val="center"/>
+          </w:tcPr>
+          <w:p>
+            <w:pPr>
+              <w:spacing w:line="360" w:lineRule="auto"/>
+              <w:contextualSpacing/>
+              <w:rPr>
+                <w:rFonts w:ascii="Times New Roman" w:hAnsi="Times New Roman" w:cs="Times New Roman"/>
+                <w:sz w:val="26"/>
+                <w:szCs w:val="26"/>
+              </w:rPr>
+            </w:pPr>
+            <w:r>
+              <w:rPr>
+                <w:rFonts w:ascii="Times New Roman" w:hAnsi="Times New Roman" w:cs="Times New Roman"/>
+                <w:color w:val="1F1F1F"/>
+                <w:sz w:val="26"/>
+                <w:szCs w:val="26"/>
+                <w:bdr w:val="none" w:sz="0" w:space="0" w:color="auto" w:frame="1"/>
+              </w:rPr>
+              <w:t>Chọn một khoa từ Combobox "Khoa/Bộ môn"</w:t>
+            </w:r>
+          </w:p>
+        </w:tc>
+        <w:tc>
+          <w:tcPr>
+            <w:tcW w:w="2850" w:type="dxa"/>
+            <w:gridSpan w:val="2"/>
+            <w:vAlign w:val="center"/>
+          </w:tcPr>
+          <w:p>
+            <w:pPr>
+              <w:spacing w:line="360" w:lineRule="auto"/>
+              <w:contextualSpacing/>
+              <w:rPr>
+                <w:rFonts w:ascii="Times New Roman" w:hAnsi="Times New Roman" w:cs="Times New Roman"/>
+                <w:sz w:val="26"/>
+                <w:szCs w:val="26"/>
+              </w:rPr>
+            </w:pPr>
+            <w:r>
+              <w:rPr>
+                <w:rFonts w:ascii="Times New Roman" w:hAnsi="Times New Roman" w:cs="Times New Roman"/>
+                <w:color w:val="1F1F1F"/>
+                <w:sz w:val="26"/>
+                <w:szCs w:val="26"/>
+                <w:bdr w:val="none" w:sz="0" w:space="0" w:color="auto" w:frame="1"/>
+              </w:rPr>
+              <w:t>Cập nhật danh sách giảng viên thuộc khoa tương ứng</w:t>
+            </w:r>
+          </w:p>
+        </w:tc>
+        <w:tc>
+          <w:tcPr>
+            <w:tcW w:w="1847" w:type="dxa"/>
+            <w:vAlign w:val="center"/>
+          </w:tcPr>
+          <w:p>
+            <w:pPr>
+              <w:spacing w:line="360" w:lineRule="auto"/>
+              <w:contextualSpacing/>
+              <w:rPr>
+                <w:rFonts w:ascii="Times New Roman" w:hAnsi="Times New Roman" w:cs="Times New Roman"/>
+                <w:sz w:val="26"/>
+                <w:szCs w:val="26"/>
+              </w:rPr>
+            </w:pPr>
+            <w:r>
+              <w:rPr>
+                <w:rFonts w:ascii="Times New Roman" w:hAnsi="Times New Roman" w:cs="Times New Roman"/>
+                <w:color w:val="1F1F1F"/>
+                <w:sz w:val="26"/>
+                <w:szCs w:val="26"/>
+                <w:bdr w:val="none" w:sz="0" w:space="0" w:color="auto" w:frame="1"/>
+              </w:rPr>
+              <w:t>Không cập nhật được danh sách</w:t>
+            </w:r>
+          </w:p>
+        </w:tc>
+      </w:tr>
+      <w:tr>
+        <w:trPr>
+          <w:jc w:val="center"/>
+        </w:trPr>
+        <w:tc>
+          <w:tcPr>
+            <w:tcW w:w="1417" w:type="dxa"/>
+            <w:vAlign w:val="center"/>
+          </w:tcPr>
+          <w:p>
+            <w:pPr>
+              <w:spacing w:line="360" w:lineRule="auto"/>
+              <w:contextualSpacing/>
+              <w:rPr>
+                <w:rFonts w:ascii="Times New Roman" w:hAnsi="Times New Roman" w:cs="Times New Roman"/>
+                <w:sz w:val="26"/>
+                <w:szCs w:val="26"/>
+              </w:rPr>
+            </w:pPr>
+            <w:r>
+              <w:rPr>
+                <w:rFonts w:ascii="Times New Roman" w:hAnsi="Times New Roman" w:cs="Times New Roman"/>
+                <w:color w:val="1F1F1F"/>
+                <w:sz w:val="26"/>
+                <w:szCs w:val="26"/>
+                <w:bdr w:val="none" w:sz="0" w:space="0" w:color="auto" w:frame="1"/>
+              </w:rPr>
+              <w:t>Xem tất cả</w:t>
+            </w:r>
+          </w:p>
+        </w:tc>
+        <w:tc>
+          <w:tcPr>
+            <w:tcW w:w="2689" w:type="dxa"/>
+            <w:gridSpan w:val="2"/>
+            <w:vAlign w:val="center"/>
+          </w:tcPr>
+          <w:p>
+            <w:pPr>
+              <w:spacing w:line="360" w:lineRule="auto"/>
+              <w:contextualSpacing/>
+              <w:rPr>
+                <w:rFonts w:ascii="Times New Roman" w:hAnsi="Times New Roman" w:cs="Times New Roman"/>
+                <w:sz w:val="26"/>
+                <w:szCs w:val="26"/>
+              </w:rPr>
+            </w:pPr>
+            <w:r>
+              <w:rPr>
+                <w:rFonts w:ascii="Times New Roman" w:hAnsi="Times New Roman" w:cs="Times New Roman"/>
+                <w:color w:val="1F1F1F"/>
+                <w:sz w:val="26"/>
+                <w:szCs w:val="26"/>
+                <w:bdr w:val="none" w:sz="0" w:space="0" w:color="auto" w:frame="1"/>
+              </w:rPr>
+              <w:t>Nhấn nút "Xem tất cả" trên thẻ của giảng viên</w:t>
+            </w:r>
+          </w:p>
+        </w:tc>
+        <w:tc>
+          <w:tcPr>
+            <w:tcW w:w="2850" w:type="dxa"/>
+            <w:gridSpan w:val="2"/>
+            <w:vAlign w:val="center"/>
+          </w:tcPr>
+          <w:p>
+            <w:pPr>
+              <w:spacing w:line="360" w:lineRule="auto"/>
+              <w:contextualSpacing/>
+              <w:rPr>
+                <w:rFonts w:ascii="Times New Roman" w:hAnsi="Times New Roman" w:cs="Times New Roman"/>
+                <w:sz w:val="26"/>
+                <w:szCs w:val="26"/>
+              </w:rPr>
+            </w:pPr>
+            <w:r>
+              <w:rPr>
+                <w:rFonts w:ascii="Times New Roman" w:hAnsi="Times New Roman" w:cs="Times New Roman"/>
+                <w:color w:val="1F1F1F"/>
+                <w:sz w:val="26"/>
+                <w:szCs w:val="26"/>
+                <w:bdr w:val="none" w:sz="0" w:space="0" w:color="auto" w:frame="1"/>
+              </w:rPr>
+              <w:t>Hiển thị chi tiết toàn bộ các lớp mà giảng viên đó đang phụ trách</w:t>
+            </w:r>
+          </w:p>
+        </w:tc>
+        <w:tc>
+          <w:tcPr>
+            <w:tcW w:w="1847" w:type="dxa"/>
+            <w:vAlign w:val="center"/>
+          </w:tcPr>
+          <w:p>
+            <w:pPr>
+              <w:spacing w:line="360" w:lineRule="auto"/>
+              <w:contextualSpacing/>
+              <w:rPr>
+                <w:rFonts w:ascii="Times New Roman" w:hAnsi="Times New Roman" w:cs="Times New Roman"/>
+                <w:sz w:val="26"/>
+                <w:szCs w:val="26"/>
+              </w:rPr>
+            </w:pPr>
+            <w:r>
+              <w:rPr>
+                <w:rFonts w:ascii="Times New Roman" w:hAnsi="Times New Roman" w:cs="Times New Roman"/>
+                <w:color w:val="1F1F1F"/>
+                <w:sz w:val="26"/>
+                <w:szCs w:val="26"/>
+                <w:bdr w:val="none" w:sz="0" w:space="0" w:color="auto" w:frame="1"/>
+              </w:rPr>
+              <w:t>Lỗi không truy xuất được dữ liệu chi tiết</w:t>
+            </w:r>
+          </w:p>
+        </w:tc>
+      </w:tr>
+    </w:tbl>
+    <w:p>
+      <w:pPr>
+        <w:spacing w:after="0" w:line="360" w:lineRule="auto"/>
+        <w:rPr>
+          <w:rFonts w:ascii="Times New Roman" w:hAnsi="Times New Roman" w:cs="Times New Roman"/>
+          <w:b/>
+          <w:bCs/>
+          <w:sz w:val="26"/>
+          <w:szCs w:val="26"/>
+        </w:rPr>
+      </w:pPr>
+    </w:p>
+    <w:p>
+      <w:pPr>
+        <w:rPr>
+          <w:rFonts w:ascii="Times New Roman" w:hAnsi="Times New Roman" w:cs="Times New Roman"/>
+          <w:b/>
+          <w:bCs/>
+          <w:sz w:val="26"/>
+          <w:szCs w:val="26"/>
+        </w:rPr>
+      </w:pPr>
+      <w:r>
+        <w:rPr>
+          <w:rFonts w:ascii="Times New Roman" w:hAnsi="Times New Roman" w:cs="Times New Roman"/>
+          <w:b/>
+          <w:bCs/>
+          <w:sz w:val="26"/>
+          <w:szCs w:val="26"/>
+        </w:rPr>
+        <w:br w:type="page"/>
+      </w:r>
+    </w:p>
+    <w:p>
+      <w:pPr>
+        <w:spacing w:after="0" w:line="360" w:lineRule="auto"/>
+        <w:rPr>
+          <w:rFonts w:ascii="Times New Roman" w:hAnsi="Times New Roman" w:cs="Times New Roman"/>
+          <w:b/>
+          <w:bCs/>
+          <w:sz w:val="26"/>
+          <w:szCs w:val="26"/>
+        </w:rPr>
+      </w:pPr>
+      <w:r>
+        <w:rPr>
+          <w:rFonts w:ascii="Times New Roman" w:hAnsi="Times New Roman" w:cs="Times New Roman"/>
+          <w:b/>
+          <w:bCs/>
+          <w:sz w:val="26"/>
+          <w:szCs w:val="26"/>
+        </w:rPr>
+        <w:lastRenderedPageBreak/>
         <w:t>2.15. Giao diện thống kê và xuất báo cáo</w:t>
       </w:r>
     </w:p>
@@ -217,6 +2267,7 @@
     <w:p>
       <w:pPr>
         <w:spacing w:after="0" w:line="360" w:lineRule="auto"/>
+        <w:jc w:val="center"/>
         <w:rPr>
           <w:rFonts w:ascii="Times New Roman" w:hAnsi="Times New Roman" w:cs="Times New Roman"/>
           <w:b/>
@@ -231,8 +2282,54 @@
           <w:sz w:val="26"/>
           <w:szCs w:val="26"/>
         </w:rPr>
-        <w:br/>
+        <w:drawing>
+          <wp:inline distT="0" distB="0" distL="0" distR="0" wp14:anchorId="3CC7A8BC" wp14:editId="28828259">
+            <wp:extent cx="5816991" cy="4653826"/>
+            <wp:effectExtent l="0" t="0" r="0" b="0"/>
+            <wp:docPr id="368472954" name="Picture 1"/>
+            <wp:cNvGraphicFramePr>
+              <a:graphicFrameLocks xmlns:a="http://schemas.openxmlformats.org/drawingml/2006/main" noChangeAspect="1"/>
+            </wp:cNvGraphicFramePr>
+            <a:graphic xmlns:a="http://schemas.openxmlformats.org/drawingml/2006/main">
+              <a:graphicData uri="http://schemas.openxmlformats.org/drawingml/2006/picture">
+                <pic:pic xmlns:pic="http://schemas.openxmlformats.org/drawingml/2006/picture">
+                  <pic:nvPicPr>
+                    <pic:cNvPr id="368472954" name=""/>
+                    <pic:cNvPicPr/>
+                  </pic:nvPicPr>
+                  <pic:blipFill>
+                    <a:blip r:embed="rId6"/>
+                    <a:stretch>
+                      <a:fillRect/>
+                    </a:stretch>
+                  </pic:blipFill>
+                  <pic:spPr>
+                    <a:xfrm>
+                      <a:off x="0" y="0"/>
+                      <a:ext cx="5840955" cy="4672998"/>
+                    </a:xfrm>
+                    <a:prstGeom prst="rect">
+                      <a:avLst/>
+                    </a:prstGeom>
+                  </pic:spPr>
+                </pic:pic>
+              </a:graphicData>
+            </a:graphic>
+          </wp:inline>
+        </w:drawing>
       </w:r>
+    </w:p>
+    <w:p>
+      <w:pPr>
+        <w:spacing w:after="0" w:line="360" w:lineRule="auto"/>
+        <w:rPr>
+          <w:rFonts w:ascii="Times New Roman" w:hAnsi="Times New Roman" w:cs="Times New Roman"/>
+          <w:b/>
+          <w:bCs/>
+          <w:sz w:val="26"/>
+          <w:szCs w:val="26"/>
+        </w:rPr>
+      </w:pPr>
       <w:r>
         <w:rPr>
           <w:rFonts w:ascii="Times New Roman" w:hAnsi="Times New Roman" w:cs="Times New Roman"/>
@@ -275,6 +2372,1905 @@
         <w:t>Đặc tả chi tiết</w:t>
       </w:r>
     </w:p>
+    <w:tbl>
+      <w:tblPr>
+        <w:tblStyle w:val="TableGrid3"/>
+        <w:tblW w:w="0" w:type="auto"/>
+        <w:jc w:val="center"/>
+        <w:tblLook w:val="04A0" w:firstRow="1" w:lastRow="0" w:firstColumn="1" w:lastColumn="0" w:noHBand="0" w:noVBand="1"/>
+      </w:tblPr>
+      <w:tblGrid>
+        <w:gridCol w:w="1417"/>
+        <w:gridCol w:w="2462"/>
+        <w:gridCol w:w="227"/>
+        <w:gridCol w:w="1559"/>
+        <w:gridCol w:w="1291"/>
+        <w:gridCol w:w="17"/>
+        <w:gridCol w:w="1830"/>
+      </w:tblGrid>
+      <w:tr>
+        <w:trPr>
+          <w:jc w:val="center"/>
+        </w:trPr>
+        <w:tc>
+          <w:tcPr>
+            <w:tcW w:w="1417" w:type="dxa"/>
+            <w:shd w:val="clear" w:color="auto" w:fill="C1E4F5" w:themeFill="accent1" w:themeFillTint="33"/>
+            <w:vAlign w:val="center"/>
+          </w:tcPr>
+          <w:p>
+            <w:pPr>
+              <w:spacing w:line="360" w:lineRule="auto"/>
+              <w:contextualSpacing/>
+              <w:rPr>
+                <w:rFonts w:ascii="Times New Roman" w:hAnsi="Times New Roman" w:cs="Times New Roman"/>
+                <w:b/>
+                <w:sz w:val="26"/>
+                <w:szCs w:val="26"/>
+              </w:rPr>
+            </w:pPr>
+            <w:r>
+              <w:rPr>
+                <w:rStyle w:val="Strong"/>
+                <w:rFonts w:ascii="Times New Roman" w:hAnsi="Times New Roman" w:cs="Times New Roman"/>
+                <w:color w:val="1F1F1F"/>
+                <w:sz w:val="26"/>
+                <w:szCs w:val="26"/>
+                <w:bdr w:val="none" w:sz="0" w:space="0" w:color="auto" w:frame="1"/>
+              </w:rPr>
+              <w:t>Màn hình</w:t>
+            </w:r>
+          </w:p>
+        </w:tc>
+        <w:tc>
+          <w:tcPr>
+            <w:tcW w:w="7386" w:type="dxa"/>
+            <w:gridSpan w:val="6"/>
+            <w:vAlign w:val="center"/>
+          </w:tcPr>
+          <w:p>
+            <w:pPr>
+              <w:spacing w:line="360" w:lineRule="auto"/>
+              <w:contextualSpacing/>
+              <w:rPr>
+                <w:rFonts w:ascii="Times New Roman" w:hAnsi="Times New Roman" w:cs="Times New Roman"/>
+                <w:sz w:val="26"/>
+                <w:szCs w:val="26"/>
+              </w:rPr>
+            </w:pPr>
+            <w:r>
+              <w:rPr>
+                <w:rStyle w:val="Strong"/>
+                <w:rFonts w:ascii="Times New Roman" w:hAnsi="Times New Roman" w:cs="Times New Roman"/>
+                <w:color w:val="1F1F1F"/>
+                <w:sz w:val="26"/>
+                <w:szCs w:val="26"/>
+                <w:bdr w:val="none" w:sz="0" w:space="0" w:color="auto" w:frame="1"/>
+              </w:rPr>
+              <w:t>Báo cáo &amp; Thống kê</w:t>
+            </w:r>
+          </w:p>
+        </w:tc>
+      </w:tr>
+      <w:tr>
+        <w:trPr>
+          <w:jc w:val="center"/>
+        </w:trPr>
+        <w:tc>
+          <w:tcPr>
+            <w:tcW w:w="1417" w:type="dxa"/>
+            <w:shd w:val="clear" w:color="auto" w:fill="C1E4F5" w:themeFill="accent1" w:themeFillTint="33"/>
+            <w:vAlign w:val="center"/>
+          </w:tcPr>
+          <w:p>
+            <w:pPr>
+              <w:spacing w:line="360" w:lineRule="auto"/>
+              <w:contextualSpacing/>
+              <w:rPr>
+                <w:rFonts w:ascii="Times New Roman" w:hAnsi="Times New Roman" w:cs="Times New Roman"/>
+                <w:b/>
+                <w:bCs/>
+                <w:sz w:val="26"/>
+                <w:szCs w:val="26"/>
+              </w:rPr>
+            </w:pPr>
+            <w:r>
+              <w:rPr>
+                <w:rFonts w:ascii="Times New Roman" w:hAnsi="Times New Roman" w:cs="Times New Roman"/>
+                <w:b/>
+                <w:bCs/>
+                <w:color w:val="1F1F1F"/>
+                <w:sz w:val="26"/>
+                <w:szCs w:val="26"/>
+                <w:bdr w:val="none" w:sz="0" w:space="0" w:color="auto" w:frame="1"/>
+              </w:rPr>
+              <w:t>Mô tả</w:t>
+            </w:r>
+          </w:p>
+        </w:tc>
+        <w:tc>
+          <w:tcPr>
+            <w:tcW w:w="7386" w:type="dxa"/>
+            <w:gridSpan w:val="6"/>
+            <w:vAlign w:val="center"/>
+          </w:tcPr>
+          <w:p>
+            <w:pPr>
+              <w:spacing w:line="360" w:lineRule="auto"/>
+              <w:contextualSpacing/>
+              <w:rPr>
+                <w:rFonts w:ascii="Times New Roman" w:hAnsi="Times New Roman" w:cs="Times New Roman"/>
+                <w:sz w:val="26"/>
+                <w:szCs w:val="26"/>
+              </w:rPr>
+            </w:pPr>
+            <w:r>
+              <w:rPr>
+                <w:rFonts w:ascii="Times New Roman" w:hAnsi="Times New Roman" w:cs="Times New Roman"/>
+                <w:color w:val="1F1F1F"/>
+                <w:sz w:val="26"/>
+                <w:szCs w:val="26"/>
+                <w:bdr w:val="none" w:sz="0" w:space="0" w:color="auto" w:frame="1"/>
+              </w:rPr>
+              <w:t>Hệ thống cho phép quản trị viên xem các số liệu thống kê tổng quan của toàn trường, theo khoa và xuất báo cáo.</w:t>
+            </w:r>
+          </w:p>
+        </w:tc>
+      </w:tr>
+      <w:tr>
+        <w:trPr>
+          <w:jc w:val="center"/>
+        </w:trPr>
+        <w:tc>
+          <w:tcPr>
+            <w:tcW w:w="1417" w:type="dxa"/>
+            <w:shd w:val="clear" w:color="auto" w:fill="C1E4F5" w:themeFill="accent1" w:themeFillTint="33"/>
+            <w:vAlign w:val="center"/>
+          </w:tcPr>
+          <w:p>
+            <w:pPr>
+              <w:spacing w:line="360" w:lineRule="auto"/>
+              <w:contextualSpacing/>
+              <w:rPr>
+                <w:rFonts w:ascii="Times New Roman" w:hAnsi="Times New Roman" w:cs="Times New Roman"/>
+                <w:b/>
+                <w:bCs/>
+                <w:sz w:val="26"/>
+                <w:szCs w:val="26"/>
+              </w:rPr>
+            </w:pPr>
+            <w:r>
+              <w:rPr>
+                <w:rFonts w:ascii="Times New Roman" w:hAnsi="Times New Roman" w:cs="Times New Roman"/>
+                <w:b/>
+                <w:bCs/>
+                <w:color w:val="1F1F1F"/>
+                <w:sz w:val="26"/>
+                <w:szCs w:val="26"/>
+                <w:bdr w:val="none" w:sz="0" w:space="0" w:color="auto" w:frame="1"/>
+              </w:rPr>
+              <w:t>Truy cập</w:t>
+            </w:r>
+          </w:p>
+        </w:tc>
+        <w:tc>
+          <w:tcPr>
+            <w:tcW w:w="7386" w:type="dxa"/>
+            <w:gridSpan w:val="6"/>
+            <w:vAlign w:val="center"/>
+          </w:tcPr>
+          <w:p>
+            <w:pPr>
+              <w:spacing w:line="360" w:lineRule="auto"/>
+              <w:contextualSpacing/>
+              <w:rPr>
+                <w:rFonts w:ascii="Times New Roman" w:hAnsi="Times New Roman" w:cs="Times New Roman"/>
+                <w:sz w:val="26"/>
+                <w:szCs w:val="26"/>
+              </w:rPr>
+            </w:pPr>
+            <w:r>
+              <w:rPr>
+                <w:rFonts w:ascii="Times New Roman" w:hAnsi="Times New Roman" w:cs="Times New Roman"/>
+                <w:color w:val="1F1F1F"/>
+                <w:sz w:val="26"/>
+                <w:szCs w:val="26"/>
+                <w:bdr w:val="none" w:sz="0" w:space="0" w:color="auto" w:frame="1"/>
+              </w:rPr>
+              <w:t>Quản trị viên bấm vào menu "Báo cáo &amp; Thống kê" ở thanh điều hướng bên trái.</w:t>
+            </w:r>
+          </w:p>
+        </w:tc>
+      </w:tr>
+      <w:tr>
+        <w:trPr>
+          <w:jc w:val="center"/>
+        </w:trPr>
+        <w:tc>
+          <w:tcPr>
+            <w:tcW w:w="1417" w:type="dxa"/>
+            <w:shd w:val="clear" w:color="auto" w:fill="C1E4F5" w:themeFill="accent1" w:themeFillTint="33"/>
+            <w:vAlign w:val="center"/>
+          </w:tcPr>
+          <w:p>
+            <w:pPr>
+              <w:spacing w:line="360" w:lineRule="auto"/>
+              <w:contextualSpacing/>
+              <w:rPr>
+                <w:rFonts w:ascii="Times New Roman" w:hAnsi="Times New Roman" w:cs="Times New Roman"/>
+                <w:b/>
+                <w:bCs/>
+                <w:sz w:val="26"/>
+                <w:szCs w:val="26"/>
+              </w:rPr>
+            </w:pPr>
+            <w:r>
+              <w:rPr>
+                <w:rFonts w:ascii="Times New Roman" w:hAnsi="Times New Roman" w:cs="Times New Roman"/>
+                <w:b/>
+                <w:bCs/>
+                <w:color w:val="1F1F1F"/>
+                <w:sz w:val="26"/>
+                <w:szCs w:val="26"/>
+                <w:bdr w:val="none" w:sz="0" w:space="0" w:color="auto" w:frame="1"/>
+              </w:rPr>
+              <w:t>Đối tượng</w:t>
+            </w:r>
+          </w:p>
+        </w:tc>
+        <w:tc>
+          <w:tcPr>
+            <w:tcW w:w="7386" w:type="dxa"/>
+            <w:gridSpan w:val="6"/>
+            <w:vAlign w:val="center"/>
+          </w:tcPr>
+          <w:p>
+            <w:pPr>
+              <w:spacing w:line="360" w:lineRule="auto"/>
+              <w:contextualSpacing/>
+              <w:rPr>
+                <w:rFonts w:ascii="Times New Roman" w:hAnsi="Times New Roman" w:cs="Times New Roman"/>
+                <w:sz w:val="26"/>
+                <w:szCs w:val="26"/>
+              </w:rPr>
+            </w:pPr>
+            <w:r>
+              <w:rPr>
+                <w:rFonts w:ascii="Times New Roman" w:hAnsi="Times New Roman" w:cs="Times New Roman"/>
+                <w:color w:val="1F1F1F"/>
+                <w:sz w:val="26"/>
+                <w:szCs w:val="26"/>
+                <w:bdr w:val="none" w:sz="0" w:space="0" w:color="auto" w:frame="1"/>
+              </w:rPr>
+              <w:t>Quản trị viên (Admin)</w:t>
+            </w:r>
+          </w:p>
+        </w:tc>
+      </w:tr>
+      <w:tr>
+        <w:trPr>
+          <w:jc w:val="center"/>
+        </w:trPr>
+        <w:tc>
+          <w:tcPr>
+            <w:tcW w:w="8803" w:type="dxa"/>
+            <w:gridSpan w:val="7"/>
+          </w:tcPr>
+          <w:p>
+            <w:pPr>
+              <w:spacing w:line="360" w:lineRule="auto"/>
+              <w:contextualSpacing/>
+              <w:rPr>
+                <w:rFonts w:ascii="Times New Roman" w:hAnsi="Times New Roman" w:cs="Times New Roman"/>
+                <w:b/>
+                <w:sz w:val="26"/>
+                <w:szCs w:val="26"/>
+              </w:rPr>
+            </w:pPr>
+            <w:r>
+              <w:rPr>
+                <w:rFonts w:ascii="Times New Roman" w:hAnsi="Times New Roman" w:cs="Times New Roman"/>
+                <w:b/>
+                <w:sz w:val="26"/>
+                <w:szCs w:val="26"/>
+              </w:rPr>
+              <w:t>Nội dung</w:t>
+            </w:r>
+          </w:p>
+        </w:tc>
+      </w:tr>
+      <w:tr>
+        <w:trPr>
+          <w:jc w:val="center"/>
+        </w:trPr>
+        <w:tc>
+          <w:tcPr>
+            <w:tcW w:w="1417" w:type="dxa"/>
+            <w:shd w:val="clear" w:color="auto" w:fill="C1E4F5" w:themeFill="accent1" w:themeFillTint="33"/>
+            <w:vAlign w:val="center"/>
+          </w:tcPr>
+          <w:p>
+            <w:pPr>
+              <w:spacing w:line="360" w:lineRule="auto"/>
+              <w:contextualSpacing/>
+              <w:rPr>
+                <w:rFonts w:ascii="Times New Roman" w:hAnsi="Times New Roman" w:cs="Times New Roman"/>
+                <w:b/>
+                <w:sz w:val="26"/>
+                <w:szCs w:val="26"/>
+              </w:rPr>
+            </w:pPr>
+            <w:r>
+              <w:rPr>
+                <w:rStyle w:val="Strong"/>
+                <w:rFonts w:ascii="Times New Roman" w:hAnsi="Times New Roman" w:cs="Times New Roman"/>
+                <w:color w:val="1F1F1F"/>
+                <w:sz w:val="26"/>
+                <w:szCs w:val="26"/>
+                <w:bdr w:val="none" w:sz="0" w:space="0" w:color="auto" w:frame="1"/>
+              </w:rPr>
+              <w:t>Mục</w:t>
+            </w:r>
+          </w:p>
+        </w:tc>
+        <w:tc>
+          <w:tcPr>
+            <w:tcW w:w="2462" w:type="dxa"/>
+            <w:shd w:val="clear" w:color="auto" w:fill="C1E4F5" w:themeFill="accent1" w:themeFillTint="33"/>
+            <w:vAlign w:val="center"/>
+          </w:tcPr>
+          <w:p>
+            <w:pPr>
+              <w:spacing w:line="360" w:lineRule="auto"/>
+              <w:contextualSpacing/>
+              <w:rPr>
+                <w:rFonts w:ascii="Times New Roman" w:hAnsi="Times New Roman" w:cs="Times New Roman"/>
+                <w:b/>
+                <w:sz w:val="26"/>
+                <w:szCs w:val="26"/>
+              </w:rPr>
+            </w:pPr>
+            <w:r>
+              <w:rPr>
+                <w:rStyle w:val="Strong"/>
+                <w:rFonts w:ascii="Times New Roman" w:hAnsi="Times New Roman" w:cs="Times New Roman"/>
+                <w:color w:val="1F1F1F"/>
+                <w:sz w:val="26"/>
+                <w:szCs w:val="26"/>
+                <w:bdr w:val="none" w:sz="0" w:space="0" w:color="auto" w:frame="1"/>
+              </w:rPr>
+              <w:t>Kiểu</w:t>
+            </w:r>
+          </w:p>
+        </w:tc>
+        <w:tc>
+          <w:tcPr>
+            <w:tcW w:w="1786" w:type="dxa"/>
+            <w:gridSpan w:val="2"/>
+            <w:shd w:val="clear" w:color="auto" w:fill="C1E4F5" w:themeFill="accent1" w:themeFillTint="33"/>
+            <w:vAlign w:val="center"/>
+          </w:tcPr>
+          <w:p>
+            <w:pPr>
+              <w:spacing w:line="360" w:lineRule="auto"/>
+              <w:contextualSpacing/>
+              <w:rPr>
+                <w:rFonts w:ascii="Times New Roman" w:hAnsi="Times New Roman" w:cs="Times New Roman"/>
+                <w:b/>
+                <w:sz w:val="26"/>
+                <w:szCs w:val="26"/>
+              </w:rPr>
+            </w:pPr>
+            <w:r>
+              <w:rPr>
+                <w:rStyle w:val="Strong"/>
+                <w:rFonts w:ascii="Times New Roman" w:hAnsi="Times New Roman" w:cs="Times New Roman"/>
+                <w:color w:val="1F1F1F"/>
+                <w:sz w:val="26"/>
+                <w:szCs w:val="26"/>
+                <w:bdr w:val="none" w:sz="0" w:space="0" w:color="auto" w:frame="1"/>
+              </w:rPr>
+              <w:t>Dữ liệu</w:t>
+            </w:r>
+          </w:p>
+        </w:tc>
+        <w:tc>
+          <w:tcPr>
+            <w:tcW w:w="3138" w:type="dxa"/>
+            <w:gridSpan w:val="3"/>
+            <w:shd w:val="clear" w:color="auto" w:fill="C1E4F5" w:themeFill="accent1" w:themeFillTint="33"/>
+            <w:vAlign w:val="center"/>
+          </w:tcPr>
+          <w:p>
+            <w:pPr>
+              <w:spacing w:line="360" w:lineRule="auto"/>
+              <w:contextualSpacing/>
+              <w:rPr>
+                <w:rFonts w:ascii="Times New Roman" w:hAnsi="Times New Roman" w:cs="Times New Roman"/>
+                <w:b/>
+                <w:sz w:val="26"/>
+                <w:szCs w:val="26"/>
+              </w:rPr>
+            </w:pPr>
+            <w:r>
+              <w:rPr>
+                <w:rStyle w:val="Strong"/>
+                <w:rFonts w:ascii="Times New Roman" w:hAnsi="Times New Roman" w:cs="Times New Roman"/>
+                <w:color w:val="1F1F1F"/>
+                <w:sz w:val="26"/>
+                <w:szCs w:val="26"/>
+                <w:bdr w:val="none" w:sz="0" w:space="0" w:color="auto" w:frame="1"/>
+              </w:rPr>
+              <w:t>Mô tả</w:t>
+            </w:r>
+          </w:p>
+        </w:tc>
+      </w:tr>
+      <w:tr>
+        <w:trPr>
+          <w:jc w:val="center"/>
+        </w:trPr>
+        <w:tc>
+          <w:tcPr>
+            <w:tcW w:w="1417" w:type="dxa"/>
+            <w:vAlign w:val="center"/>
+          </w:tcPr>
+          <w:p>
+            <w:pPr>
+              <w:spacing w:line="360" w:lineRule="auto"/>
+              <w:contextualSpacing/>
+              <w:rPr>
+                <w:rFonts w:ascii="Times New Roman" w:hAnsi="Times New Roman" w:cs="Times New Roman"/>
+                <w:sz w:val="26"/>
+                <w:szCs w:val="26"/>
+              </w:rPr>
+            </w:pPr>
+            <w:r>
+              <w:rPr>
+                <w:rFonts w:ascii="Times New Roman" w:hAnsi="Times New Roman" w:cs="Times New Roman"/>
+                <w:color w:val="1F1F1F"/>
+                <w:sz w:val="26"/>
+                <w:szCs w:val="26"/>
+                <w:bdr w:val="none" w:sz="0" w:space="0" w:color="auto" w:frame="1"/>
+              </w:rPr>
+              <w:lastRenderedPageBreak/>
+              <w:t>1</w:t>
+            </w:r>
+          </w:p>
+        </w:tc>
+        <w:tc>
+          <w:tcPr>
+            <w:tcW w:w="2462" w:type="dxa"/>
+            <w:vAlign w:val="center"/>
+          </w:tcPr>
+          <w:p>
+            <w:pPr>
+              <w:spacing w:line="360" w:lineRule="auto"/>
+              <w:contextualSpacing/>
+              <w:rPr>
+                <w:rFonts w:ascii="Times New Roman" w:hAnsi="Times New Roman" w:cs="Times New Roman"/>
+                <w:sz w:val="26"/>
+                <w:szCs w:val="26"/>
+              </w:rPr>
+            </w:pPr>
+            <w:r>
+              <w:rPr>
+                <w:rFonts w:ascii="Times New Roman" w:hAnsi="Times New Roman" w:cs="Times New Roman"/>
+                <w:color w:val="1F1F1F"/>
+                <w:sz w:val="26"/>
+                <w:szCs w:val="26"/>
+                <w:bdr w:val="none" w:sz="0" w:space="0" w:color="auto" w:frame="1"/>
+              </w:rPr>
+              <w:t>Menu điều hướng</w:t>
+            </w:r>
+          </w:p>
+        </w:tc>
+        <w:tc>
+          <w:tcPr>
+            <w:tcW w:w="1786" w:type="dxa"/>
+            <w:gridSpan w:val="2"/>
+            <w:vAlign w:val="center"/>
+          </w:tcPr>
+          <w:p>
+            <w:pPr>
+              <w:spacing w:line="360" w:lineRule="auto"/>
+              <w:contextualSpacing/>
+              <w:rPr>
+                <w:rFonts w:ascii="Times New Roman" w:hAnsi="Times New Roman" w:cs="Times New Roman"/>
+                <w:sz w:val="26"/>
+                <w:szCs w:val="26"/>
+              </w:rPr>
+            </w:pPr>
+          </w:p>
+        </w:tc>
+        <w:tc>
+          <w:tcPr>
+            <w:tcW w:w="3138" w:type="dxa"/>
+            <w:gridSpan w:val="3"/>
+            <w:vAlign w:val="center"/>
+          </w:tcPr>
+          <w:p>
+            <w:pPr>
+              <w:spacing w:line="360" w:lineRule="auto"/>
+              <w:contextualSpacing/>
+              <w:rPr>
+                <w:rFonts w:ascii="Times New Roman" w:hAnsi="Times New Roman" w:cs="Times New Roman"/>
+                <w:sz w:val="26"/>
+                <w:szCs w:val="26"/>
+              </w:rPr>
+            </w:pPr>
+            <w:r>
+              <w:rPr>
+                <w:rFonts w:ascii="Times New Roman" w:hAnsi="Times New Roman" w:cs="Times New Roman"/>
+                <w:color w:val="1F1F1F"/>
+                <w:sz w:val="26"/>
+                <w:szCs w:val="26"/>
+                <w:bdr w:val="none" w:sz="0" w:space="0" w:color="auto" w:frame="1"/>
+              </w:rPr>
+              <w:t>Thanh menu sidebar, làm nổi bật mục "Báo cáo &amp; Thống kê".</w:t>
+            </w:r>
+          </w:p>
+        </w:tc>
+      </w:tr>
+      <w:tr>
+        <w:trPr>
+          <w:jc w:val="center"/>
+        </w:trPr>
+        <w:tc>
+          <w:tcPr>
+            <w:tcW w:w="1417" w:type="dxa"/>
+            <w:vAlign w:val="center"/>
+          </w:tcPr>
+          <w:p>
+            <w:pPr>
+              <w:spacing w:line="360" w:lineRule="auto"/>
+              <w:contextualSpacing/>
+              <w:rPr>
+                <w:rFonts w:ascii="Times New Roman" w:hAnsi="Times New Roman" w:cs="Times New Roman"/>
+                <w:sz w:val="26"/>
+                <w:szCs w:val="26"/>
+              </w:rPr>
+            </w:pPr>
+            <w:r>
+              <w:rPr>
+                <w:rFonts w:ascii="Times New Roman" w:hAnsi="Times New Roman" w:cs="Times New Roman"/>
+                <w:color w:val="1F1F1F"/>
+                <w:sz w:val="26"/>
+                <w:szCs w:val="26"/>
+                <w:bdr w:val="none" w:sz="0" w:space="0" w:color="auto" w:frame="1"/>
+              </w:rPr>
+              <w:t>2</w:t>
+            </w:r>
+          </w:p>
+        </w:tc>
+        <w:tc>
+          <w:tcPr>
+            <w:tcW w:w="2462" w:type="dxa"/>
+            <w:vAlign w:val="center"/>
+          </w:tcPr>
+          <w:p>
+            <w:pPr>
+              <w:spacing w:line="360" w:lineRule="auto"/>
+              <w:contextualSpacing/>
+              <w:rPr>
+                <w:rFonts w:ascii="Times New Roman" w:hAnsi="Times New Roman" w:cs="Times New Roman"/>
+                <w:sz w:val="26"/>
+                <w:szCs w:val="26"/>
+              </w:rPr>
+            </w:pPr>
+            <w:r>
+              <w:rPr>
+                <w:rFonts w:ascii="Times New Roman" w:hAnsi="Times New Roman" w:cs="Times New Roman"/>
+                <w:color w:val="1F1F1F"/>
+                <w:sz w:val="26"/>
+                <w:szCs w:val="26"/>
+                <w:bdr w:val="none" w:sz="0" w:space="0" w:color="auto" w:frame="1"/>
+              </w:rPr>
+              <w:t>Combobox &amp; Button</w:t>
+            </w:r>
+          </w:p>
+        </w:tc>
+        <w:tc>
+          <w:tcPr>
+            <w:tcW w:w="1786" w:type="dxa"/>
+            <w:gridSpan w:val="2"/>
+            <w:vAlign w:val="center"/>
+          </w:tcPr>
+          <w:p>
+            <w:pPr>
+              <w:spacing w:line="360" w:lineRule="auto"/>
+              <w:contextualSpacing/>
+              <w:rPr>
+                <w:rFonts w:ascii="Times New Roman" w:hAnsi="Times New Roman" w:cs="Times New Roman"/>
+                <w:sz w:val="26"/>
+                <w:szCs w:val="26"/>
+              </w:rPr>
+            </w:pPr>
+            <w:r>
+              <w:rPr>
+                <w:rFonts w:ascii="Times New Roman" w:hAnsi="Times New Roman" w:cs="Times New Roman"/>
+                <w:color w:val="1F1F1F"/>
+                <w:sz w:val="26"/>
+                <w:szCs w:val="26"/>
+                <w:bdr w:val="none" w:sz="0" w:space="0" w:color="auto" w:frame="1"/>
+              </w:rPr>
+              <w:t>Mặc định: Học kỳ hiện tại</w:t>
+            </w:r>
+          </w:p>
+        </w:tc>
+        <w:tc>
+          <w:tcPr>
+            <w:tcW w:w="3138" w:type="dxa"/>
+            <w:gridSpan w:val="3"/>
+            <w:vAlign w:val="center"/>
+          </w:tcPr>
+          <w:p>
+            <w:pPr>
+              <w:spacing w:line="360" w:lineRule="auto"/>
+              <w:contextualSpacing/>
+              <w:rPr>
+                <w:rFonts w:ascii="Times New Roman" w:hAnsi="Times New Roman" w:cs="Times New Roman"/>
+                <w:sz w:val="26"/>
+                <w:szCs w:val="26"/>
+              </w:rPr>
+            </w:pPr>
+            <w:r>
+              <w:rPr>
+                <w:rFonts w:ascii="Times New Roman" w:hAnsi="Times New Roman" w:cs="Times New Roman"/>
+                <w:color w:val="1F1F1F"/>
+                <w:sz w:val="26"/>
+                <w:szCs w:val="26"/>
+                <w:bdr w:val="none" w:sz="0" w:space="0" w:color="auto" w:frame="1"/>
+              </w:rPr>
+              <w:t>Dropdown chọn Học kỳ (vd: HK II/2025) và nút "Xuất báo cáo".</w:t>
+            </w:r>
+          </w:p>
+        </w:tc>
+      </w:tr>
+      <w:tr>
+        <w:trPr>
+          <w:jc w:val="center"/>
+        </w:trPr>
+        <w:tc>
+          <w:tcPr>
+            <w:tcW w:w="1417" w:type="dxa"/>
+            <w:vAlign w:val="center"/>
+          </w:tcPr>
+          <w:p>
+            <w:pPr>
+              <w:spacing w:line="360" w:lineRule="auto"/>
+              <w:contextualSpacing/>
+              <w:rPr>
+                <w:rFonts w:ascii="Times New Roman" w:hAnsi="Times New Roman" w:cs="Times New Roman"/>
+                <w:sz w:val="26"/>
+                <w:szCs w:val="26"/>
+              </w:rPr>
+            </w:pPr>
+            <w:r>
+              <w:rPr>
+                <w:rFonts w:ascii="Times New Roman" w:hAnsi="Times New Roman" w:cs="Times New Roman"/>
+                <w:color w:val="1F1F1F"/>
+                <w:sz w:val="26"/>
+                <w:szCs w:val="26"/>
+                <w:bdr w:val="none" w:sz="0" w:space="0" w:color="auto" w:frame="1"/>
+              </w:rPr>
+              <w:t>3</w:t>
+            </w:r>
+          </w:p>
+        </w:tc>
+        <w:tc>
+          <w:tcPr>
+            <w:tcW w:w="2462" w:type="dxa"/>
+            <w:vAlign w:val="center"/>
+          </w:tcPr>
+          <w:p>
+            <w:pPr>
+              <w:spacing w:line="360" w:lineRule="auto"/>
+              <w:contextualSpacing/>
+              <w:rPr>
+                <w:rFonts w:ascii="Times New Roman" w:hAnsi="Times New Roman" w:cs="Times New Roman"/>
+                <w:sz w:val="26"/>
+                <w:szCs w:val="26"/>
+              </w:rPr>
+            </w:pPr>
+            <w:r>
+              <w:rPr>
+                <w:rFonts w:ascii="Times New Roman" w:hAnsi="Times New Roman" w:cs="Times New Roman"/>
+                <w:color w:val="1F1F1F"/>
+                <w:sz w:val="26"/>
+                <w:szCs w:val="26"/>
+                <w:bdr w:val="none" w:sz="0" w:space="0" w:color="auto" w:frame="1"/>
+              </w:rPr>
+              <w:t>Tab menu</w:t>
+            </w:r>
+          </w:p>
+        </w:tc>
+        <w:tc>
+          <w:tcPr>
+            <w:tcW w:w="1786" w:type="dxa"/>
+            <w:gridSpan w:val="2"/>
+            <w:vAlign w:val="center"/>
+          </w:tcPr>
+          <w:p>
+            <w:pPr>
+              <w:spacing w:line="360" w:lineRule="auto"/>
+              <w:contextualSpacing/>
+              <w:rPr>
+                <w:rFonts w:ascii="Times New Roman" w:hAnsi="Times New Roman" w:cs="Times New Roman"/>
+                <w:sz w:val="26"/>
+                <w:szCs w:val="26"/>
+              </w:rPr>
+            </w:pPr>
+          </w:p>
+        </w:tc>
+        <w:tc>
+          <w:tcPr>
+            <w:tcW w:w="3138" w:type="dxa"/>
+            <w:gridSpan w:val="3"/>
+            <w:vAlign w:val="center"/>
+          </w:tcPr>
+          <w:p>
+            <w:pPr>
+              <w:spacing w:line="360" w:lineRule="auto"/>
+              <w:contextualSpacing/>
+              <w:rPr>
+                <w:rFonts w:ascii="Times New Roman" w:hAnsi="Times New Roman" w:cs="Times New Roman"/>
+                <w:sz w:val="26"/>
+                <w:szCs w:val="26"/>
+              </w:rPr>
+            </w:pPr>
+            <w:r>
+              <w:rPr>
+                <w:rFonts w:ascii="Times New Roman" w:hAnsi="Times New Roman" w:cs="Times New Roman"/>
+                <w:color w:val="1F1F1F"/>
+                <w:sz w:val="26"/>
+                <w:szCs w:val="26"/>
+                <w:bdr w:val="none" w:sz="0" w:space="0" w:color="auto" w:frame="1"/>
+              </w:rPr>
+              <w:t>Thanh chuyển đổi các loại báo cáo (Tổng quan, Chuyên cần, Điểm số, Học phần).</w:t>
+            </w:r>
+          </w:p>
+        </w:tc>
+      </w:tr>
+      <w:tr>
+        <w:trPr>
+          <w:jc w:val="center"/>
+        </w:trPr>
+        <w:tc>
+          <w:tcPr>
+            <w:tcW w:w="1417" w:type="dxa"/>
+            <w:vAlign w:val="center"/>
+          </w:tcPr>
+          <w:p>
+            <w:pPr>
+              <w:spacing w:line="360" w:lineRule="auto"/>
+              <w:contextualSpacing/>
+              <w:rPr>
+                <w:rFonts w:ascii="Times New Roman" w:hAnsi="Times New Roman" w:cs="Times New Roman"/>
+                <w:sz w:val="26"/>
+                <w:szCs w:val="26"/>
+              </w:rPr>
+            </w:pPr>
+            <w:r>
+              <w:rPr>
+                <w:rFonts w:ascii="Times New Roman" w:hAnsi="Times New Roman" w:cs="Times New Roman"/>
+                <w:color w:val="1F1F1F"/>
+                <w:sz w:val="26"/>
+                <w:szCs w:val="26"/>
+                <w:bdr w:val="none" w:sz="0" w:space="0" w:color="auto" w:frame="1"/>
+              </w:rPr>
+              <w:t>4</w:t>
+            </w:r>
+          </w:p>
+        </w:tc>
+        <w:tc>
+          <w:tcPr>
+            <w:tcW w:w="2462" w:type="dxa"/>
+            <w:vAlign w:val="center"/>
+          </w:tcPr>
+          <w:p>
+            <w:pPr>
+              <w:spacing w:line="360" w:lineRule="auto"/>
+              <w:contextualSpacing/>
+              <w:rPr>
+                <w:rFonts w:ascii="Times New Roman" w:hAnsi="Times New Roman" w:cs="Times New Roman"/>
+                <w:sz w:val="26"/>
+                <w:szCs w:val="26"/>
+              </w:rPr>
+            </w:pPr>
+            <w:r>
+              <w:rPr>
+                <w:rFonts w:ascii="Times New Roman" w:hAnsi="Times New Roman" w:cs="Times New Roman"/>
+                <w:color w:val="1F1F1F"/>
+                <w:sz w:val="26"/>
+                <w:szCs w:val="26"/>
+                <w:bdr w:val="none" w:sz="0" w:space="0" w:color="auto" w:frame="1"/>
+              </w:rPr>
+              <w:t>Card (Thẻ thống kê)</w:t>
+            </w:r>
+          </w:p>
+        </w:tc>
+        <w:tc>
+          <w:tcPr>
+            <w:tcW w:w="1786" w:type="dxa"/>
+            <w:gridSpan w:val="2"/>
+            <w:vAlign w:val="center"/>
+          </w:tcPr>
+          <w:p>
+            <w:pPr>
+              <w:spacing w:line="360" w:lineRule="auto"/>
+              <w:contextualSpacing/>
+              <w:rPr>
+                <w:rFonts w:ascii="Times New Roman" w:hAnsi="Times New Roman" w:cs="Times New Roman"/>
+                <w:sz w:val="26"/>
+                <w:szCs w:val="26"/>
+              </w:rPr>
+            </w:pPr>
+          </w:p>
+        </w:tc>
+        <w:tc>
+          <w:tcPr>
+            <w:tcW w:w="3138" w:type="dxa"/>
+            <w:gridSpan w:val="3"/>
+            <w:vAlign w:val="center"/>
+          </w:tcPr>
+          <w:p>
+            <w:pPr>
+              <w:spacing w:line="360" w:lineRule="auto"/>
+              <w:contextualSpacing/>
+              <w:rPr>
+                <w:rFonts w:ascii="Times New Roman" w:hAnsi="Times New Roman" w:cs="Times New Roman"/>
+                <w:sz w:val="26"/>
+                <w:szCs w:val="26"/>
+              </w:rPr>
+            </w:pPr>
+            <w:r>
+              <w:rPr>
+                <w:rFonts w:ascii="Times New Roman" w:hAnsi="Times New Roman" w:cs="Times New Roman"/>
+                <w:color w:val="1F1F1F"/>
+                <w:sz w:val="26"/>
+                <w:szCs w:val="26"/>
+                <w:bdr w:val="none" w:sz="0" w:space="0" w:color="auto" w:frame="1"/>
+              </w:rPr>
+              <w:t>Các thẻ hiển thị số liệu chung toàn trường (Tổng sinh viên, Lớp học phần, Chuyên cần TB, GPA TB).</w:t>
+            </w:r>
+          </w:p>
+        </w:tc>
+      </w:tr>
+      <w:tr>
+        <w:trPr>
+          <w:jc w:val="center"/>
+        </w:trPr>
+        <w:tc>
+          <w:tcPr>
+            <w:tcW w:w="1417" w:type="dxa"/>
+            <w:vAlign w:val="center"/>
+          </w:tcPr>
+          <w:p>
+            <w:pPr>
+              <w:spacing w:line="360" w:lineRule="auto"/>
+              <w:contextualSpacing/>
+              <w:rPr>
+                <w:rFonts w:ascii="Times New Roman" w:hAnsi="Times New Roman" w:cs="Times New Roman"/>
+                <w:sz w:val="26"/>
+                <w:szCs w:val="26"/>
+              </w:rPr>
+            </w:pPr>
+            <w:r>
+              <w:rPr>
+                <w:rFonts w:ascii="Times New Roman" w:hAnsi="Times New Roman" w:cs="Times New Roman"/>
+                <w:color w:val="1F1F1F"/>
+                <w:sz w:val="26"/>
+                <w:szCs w:val="26"/>
+                <w:bdr w:val="none" w:sz="0" w:space="0" w:color="auto" w:frame="1"/>
+              </w:rPr>
+              <w:t>5</w:t>
+            </w:r>
+          </w:p>
+        </w:tc>
+        <w:tc>
+          <w:tcPr>
+            <w:tcW w:w="2462" w:type="dxa"/>
+            <w:vAlign w:val="center"/>
+          </w:tcPr>
+          <w:p>
+            <w:pPr>
+              <w:spacing w:line="360" w:lineRule="auto"/>
+              <w:contextualSpacing/>
+              <w:rPr>
+                <w:rFonts w:ascii="Times New Roman" w:hAnsi="Times New Roman" w:cs="Times New Roman"/>
+                <w:sz w:val="26"/>
+                <w:szCs w:val="26"/>
+              </w:rPr>
+            </w:pPr>
+            <w:r>
+              <w:rPr>
+                <w:rFonts w:ascii="Times New Roman" w:hAnsi="Times New Roman" w:cs="Times New Roman"/>
+                <w:color w:val="1F1F1F"/>
+                <w:sz w:val="26"/>
+                <w:szCs w:val="26"/>
+                <w:bdr w:val="none" w:sz="0" w:space="0" w:color="auto" w:frame="1"/>
+              </w:rPr>
+              <w:t>Text</w:t>
+            </w:r>
+          </w:p>
+        </w:tc>
+        <w:tc>
+          <w:tcPr>
+            <w:tcW w:w="1786" w:type="dxa"/>
+            <w:gridSpan w:val="2"/>
+            <w:vAlign w:val="center"/>
+          </w:tcPr>
+          <w:p>
+            <w:pPr>
+              <w:spacing w:line="360" w:lineRule="auto"/>
+              <w:contextualSpacing/>
+              <w:rPr>
+                <w:rFonts w:ascii="Times New Roman" w:hAnsi="Times New Roman" w:cs="Times New Roman"/>
+                <w:sz w:val="26"/>
+                <w:szCs w:val="26"/>
+              </w:rPr>
+            </w:pPr>
+          </w:p>
+        </w:tc>
+        <w:tc>
+          <w:tcPr>
+            <w:tcW w:w="3138" w:type="dxa"/>
+            <w:gridSpan w:val="3"/>
+            <w:vAlign w:val="center"/>
+          </w:tcPr>
+          <w:p>
+            <w:pPr>
+              <w:spacing w:line="360" w:lineRule="auto"/>
+              <w:contextualSpacing/>
+              <w:rPr>
+                <w:rFonts w:ascii="Times New Roman" w:hAnsi="Times New Roman" w:cs="Times New Roman"/>
+                <w:sz w:val="26"/>
+                <w:szCs w:val="26"/>
+              </w:rPr>
+            </w:pPr>
+            <w:r>
+              <w:rPr>
+                <w:rFonts w:ascii="Times New Roman" w:hAnsi="Times New Roman" w:cs="Times New Roman"/>
+                <w:color w:val="1F1F1F"/>
+                <w:sz w:val="26"/>
+                <w:szCs w:val="26"/>
+                <w:bdr w:val="none" w:sz="0" w:space="0" w:color="auto" w:frame="1"/>
+              </w:rPr>
+              <w:t>Tiêu đề bảng biểu diễn dữ liệu (Thống kê theo khoa - HK hiện tại).</w:t>
+            </w:r>
+          </w:p>
+        </w:tc>
+      </w:tr>
+      <w:tr>
+        <w:trPr>
+          <w:jc w:val="center"/>
+        </w:trPr>
+        <w:tc>
+          <w:tcPr>
+            <w:tcW w:w="1417" w:type="dxa"/>
+            <w:vAlign w:val="center"/>
+          </w:tcPr>
+          <w:p>
+            <w:pPr>
+              <w:spacing w:line="360" w:lineRule="auto"/>
+              <w:contextualSpacing/>
+              <w:rPr>
+                <w:rFonts w:ascii="Times New Roman" w:hAnsi="Times New Roman" w:cs="Times New Roman"/>
+                <w:sz w:val="26"/>
+                <w:szCs w:val="26"/>
+              </w:rPr>
+            </w:pPr>
+            <w:r>
+              <w:rPr>
+                <w:rFonts w:ascii="Times New Roman" w:hAnsi="Times New Roman" w:cs="Times New Roman"/>
+                <w:color w:val="1F1F1F"/>
+                <w:sz w:val="26"/>
+                <w:szCs w:val="26"/>
+                <w:bdr w:val="none" w:sz="0" w:space="0" w:color="auto" w:frame="1"/>
+              </w:rPr>
+              <w:t>6</w:t>
+            </w:r>
+          </w:p>
+        </w:tc>
+        <w:tc>
+          <w:tcPr>
+            <w:tcW w:w="2462" w:type="dxa"/>
+            <w:vAlign w:val="center"/>
+          </w:tcPr>
+          <w:p>
+            <w:pPr>
+              <w:spacing w:line="360" w:lineRule="auto"/>
+              <w:contextualSpacing/>
+              <w:rPr>
+                <w:rFonts w:ascii="Times New Roman" w:hAnsi="Times New Roman" w:cs="Times New Roman"/>
+                <w:sz w:val="26"/>
+                <w:szCs w:val="26"/>
+              </w:rPr>
+            </w:pPr>
+            <w:r>
+              <w:rPr>
+                <w:rFonts w:ascii="Times New Roman" w:hAnsi="Times New Roman" w:cs="Times New Roman"/>
+                <w:color w:val="1F1F1F"/>
+                <w:sz w:val="26"/>
+                <w:szCs w:val="26"/>
+                <w:bdr w:val="none" w:sz="0" w:space="0" w:color="auto" w:frame="1"/>
+              </w:rPr>
+              <w:t>Table Header</w:t>
+            </w:r>
+          </w:p>
+        </w:tc>
+        <w:tc>
+          <w:tcPr>
+            <w:tcW w:w="1786" w:type="dxa"/>
+            <w:gridSpan w:val="2"/>
+            <w:vAlign w:val="center"/>
+          </w:tcPr>
+          <w:p>
+            <w:pPr>
+              <w:spacing w:line="360" w:lineRule="auto"/>
+              <w:contextualSpacing/>
+              <w:rPr>
+                <w:rFonts w:ascii="Times New Roman" w:hAnsi="Times New Roman" w:cs="Times New Roman"/>
+                <w:sz w:val="26"/>
+                <w:szCs w:val="26"/>
+              </w:rPr>
+            </w:pPr>
+          </w:p>
+        </w:tc>
+        <w:tc>
+          <w:tcPr>
+            <w:tcW w:w="3138" w:type="dxa"/>
+            <w:gridSpan w:val="3"/>
+            <w:vAlign w:val="center"/>
+          </w:tcPr>
+          <w:p>
+            <w:pPr>
+              <w:spacing w:line="360" w:lineRule="auto"/>
+              <w:contextualSpacing/>
+              <w:rPr>
+                <w:rFonts w:ascii="Times New Roman" w:hAnsi="Times New Roman" w:cs="Times New Roman"/>
+                <w:sz w:val="26"/>
+                <w:szCs w:val="26"/>
+              </w:rPr>
+            </w:pPr>
+            <w:r>
+              <w:rPr>
+                <w:rFonts w:ascii="Times New Roman" w:hAnsi="Times New Roman" w:cs="Times New Roman"/>
+                <w:color w:val="1F1F1F"/>
+                <w:sz w:val="26"/>
+                <w:szCs w:val="26"/>
+                <w:bdr w:val="none" w:sz="0" w:space="0" w:color="auto" w:frame="1"/>
+              </w:rPr>
+              <w:t>Tiêu đề các cột của bảng thống kê (Khoa, Sinh viên, Chuyên cần TB, GPA TB, Xếp loại).</w:t>
+            </w:r>
+          </w:p>
+        </w:tc>
+      </w:tr>
+      <w:tr>
+        <w:trPr>
+          <w:jc w:val="center"/>
+        </w:trPr>
+        <w:tc>
+          <w:tcPr>
+            <w:tcW w:w="1417" w:type="dxa"/>
+            <w:vAlign w:val="center"/>
+          </w:tcPr>
+          <w:p>
+            <w:pPr>
+              <w:spacing w:line="360" w:lineRule="auto"/>
+              <w:contextualSpacing/>
+              <w:rPr>
+                <w:rFonts w:ascii="Times New Roman" w:hAnsi="Times New Roman" w:cs="Times New Roman"/>
+                <w:sz w:val="26"/>
+                <w:szCs w:val="26"/>
+              </w:rPr>
+            </w:pPr>
+            <w:r>
+              <w:rPr>
+                <w:rFonts w:ascii="Times New Roman" w:hAnsi="Times New Roman" w:cs="Times New Roman"/>
+                <w:color w:val="1F1F1F"/>
+                <w:sz w:val="26"/>
+                <w:szCs w:val="26"/>
+                <w:bdr w:val="none" w:sz="0" w:space="0" w:color="auto" w:frame="1"/>
+              </w:rPr>
+              <w:t>7</w:t>
+            </w:r>
+          </w:p>
+        </w:tc>
+        <w:tc>
+          <w:tcPr>
+            <w:tcW w:w="2462" w:type="dxa"/>
+            <w:vAlign w:val="center"/>
+          </w:tcPr>
+          <w:p>
+            <w:pPr>
+              <w:spacing w:line="360" w:lineRule="auto"/>
+              <w:contextualSpacing/>
+              <w:rPr>
+                <w:rFonts w:ascii="Times New Roman" w:hAnsi="Times New Roman" w:cs="Times New Roman"/>
+                <w:sz w:val="26"/>
+                <w:szCs w:val="26"/>
+              </w:rPr>
+            </w:pPr>
+            <w:r>
+              <w:rPr>
+                <w:rFonts w:ascii="Times New Roman" w:hAnsi="Times New Roman" w:cs="Times New Roman"/>
+                <w:color w:val="1F1F1F"/>
+                <w:sz w:val="26"/>
+                <w:szCs w:val="26"/>
+                <w:bdr w:val="none" w:sz="0" w:space="0" w:color="auto" w:frame="1"/>
+              </w:rPr>
+              <w:t>Table Row</w:t>
+            </w:r>
+          </w:p>
+        </w:tc>
+        <w:tc>
+          <w:tcPr>
+            <w:tcW w:w="1786" w:type="dxa"/>
+            <w:gridSpan w:val="2"/>
+            <w:vAlign w:val="center"/>
+          </w:tcPr>
+          <w:p>
+            <w:pPr>
+              <w:spacing w:line="360" w:lineRule="auto"/>
+              <w:contextualSpacing/>
+              <w:rPr>
+                <w:rFonts w:ascii="Times New Roman" w:hAnsi="Times New Roman" w:cs="Times New Roman"/>
+                <w:sz w:val="26"/>
+                <w:szCs w:val="26"/>
+              </w:rPr>
+            </w:pPr>
+          </w:p>
+        </w:tc>
+        <w:tc>
+          <w:tcPr>
+            <w:tcW w:w="3138" w:type="dxa"/>
+            <w:gridSpan w:val="3"/>
+            <w:vAlign w:val="center"/>
+          </w:tcPr>
+          <w:p>
+            <w:pPr>
+              <w:spacing w:line="360" w:lineRule="auto"/>
+              <w:contextualSpacing/>
+              <w:rPr>
+                <w:rFonts w:ascii="Times New Roman" w:hAnsi="Times New Roman" w:cs="Times New Roman"/>
+                <w:sz w:val="26"/>
+                <w:szCs w:val="26"/>
+              </w:rPr>
+            </w:pPr>
+            <w:r>
+              <w:rPr>
+                <w:rFonts w:ascii="Times New Roman" w:hAnsi="Times New Roman" w:cs="Times New Roman"/>
+                <w:color w:val="1F1F1F"/>
+                <w:sz w:val="26"/>
+                <w:szCs w:val="26"/>
+                <w:bdr w:val="none" w:sz="0" w:space="0" w:color="auto" w:frame="1"/>
+              </w:rPr>
+              <w:t>Dòng dữ liệu thống kê của khoa Ngoại ngữ.</w:t>
+            </w:r>
+          </w:p>
+        </w:tc>
+      </w:tr>
+      <w:tr>
+        <w:trPr>
+          <w:jc w:val="center"/>
+        </w:trPr>
+        <w:tc>
+          <w:tcPr>
+            <w:tcW w:w="1417" w:type="dxa"/>
+            <w:vAlign w:val="center"/>
+          </w:tcPr>
+          <w:p>
+            <w:pPr>
+              <w:spacing w:line="360" w:lineRule="auto"/>
+              <w:contextualSpacing/>
+              <w:rPr>
+                <w:rFonts w:ascii="Times New Roman" w:hAnsi="Times New Roman" w:cs="Times New Roman"/>
+                <w:sz w:val="26"/>
+                <w:szCs w:val="26"/>
+              </w:rPr>
+            </w:pPr>
+            <w:r>
+              <w:rPr>
+                <w:rFonts w:ascii="Times New Roman" w:hAnsi="Times New Roman" w:cs="Times New Roman"/>
+                <w:color w:val="1F1F1F"/>
+                <w:sz w:val="26"/>
+                <w:szCs w:val="26"/>
+                <w:bdr w:val="none" w:sz="0" w:space="0" w:color="auto" w:frame="1"/>
+              </w:rPr>
+              <w:t>8</w:t>
+            </w:r>
+          </w:p>
+        </w:tc>
+        <w:tc>
+          <w:tcPr>
+            <w:tcW w:w="2462" w:type="dxa"/>
+            <w:vAlign w:val="center"/>
+          </w:tcPr>
+          <w:p>
+            <w:pPr>
+              <w:spacing w:line="360" w:lineRule="auto"/>
+              <w:contextualSpacing/>
+              <w:rPr>
+                <w:rFonts w:ascii="Times New Roman" w:hAnsi="Times New Roman" w:cs="Times New Roman"/>
+                <w:sz w:val="26"/>
+                <w:szCs w:val="26"/>
+              </w:rPr>
+            </w:pPr>
+            <w:r>
+              <w:rPr>
+                <w:rFonts w:ascii="Times New Roman" w:hAnsi="Times New Roman" w:cs="Times New Roman"/>
+                <w:color w:val="1F1F1F"/>
+                <w:sz w:val="26"/>
+                <w:szCs w:val="26"/>
+                <w:bdr w:val="none" w:sz="0" w:space="0" w:color="auto" w:frame="1"/>
+              </w:rPr>
+              <w:t>Table Row</w:t>
+            </w:r>
+          </w:p>
+        </w:tc>
+        <w:tc>
+          <w:tcPr>
+            <w:tcW w:w="1786" w:type="dxa"/>
+            <w:gridSpan w:val="2"/>
+            <w:vAlign w:val="center"/>
+          </w:tcPr>
+          <w:p>
+            <w:pPr>
+              <w:spacing w:line="360" w:lineRule="auto"/>
+              <w:contextualSpacing/>
+              <w:rPr>
+                <w:rFonts w:ascii="Times New Roman" w:hAnsi="Times New Roman" w:cs="Times New Roman"/>
+                <w:sz w:val="26"/>
+                <w:szCs w:val="26"/>
+              </w:rPr>
+            </w:pPr>
+          </w:p>
+        </w:tc>
+        <w:tc>
+          <w:tcPr>
+            <w:tcW w:w="3138" w:type="dxa"/>
+            <w:gridSpan w:val="3"/>
+            <w:vAlign w:val="center"/>
+          </w:tcPr>
+          <w:p>
+            <w:pPr>
+              <w:spacing w:line="360" w:lineRule="auto"/>
+              <w:contextualSpacing/>
+              <w:rPr>
+                <w:rFonts w:ascii="Times New Roman" w:hAnsi="Times New Roman" w:cs="Times New Roman"/>
+                <w:sz w:val="26"/>
+                <w:szCs w:val="26"/>
+              </w:rPr>
+            </w:pPr>
+            <w:r>
+              <w:rPr>
+                <w:rFonts w:ascii="Times New Roman" w:hAnsi="Times New Roman" w:cs="Times New Roman"/>
+                <w:color w:val="1F1F1F"/>
+                <w:sz w:val="26"/>
+                <w:szCs w:val="26"/>
+                <w:bdr w:val="none" w:sz="0" w:space="0" w:color="auto" w:frame="1"/>
+              </w:rPr>
+              <w:t>Dòng dữ liệu thống kê của khoa CNTT.</w:t>
+            </w:r>
+          </w:p>
+        </w:tc>
+      </w:tr>
+      <w:tr>
+        <w:trPr>
+          <w:jc w:val="center"/>
+        </w:trPr>
+        <w:tc>
+          <w:tcPr>
+            <w:tcW w:w="1417" w:type="dxa"/>
+            <w:vAlign w:val="center"/>
+          </w:tcPr>
+          <w:p>
+            <w:pPr>
+              <w:spacing w:line="360" w:lineRule="auto"/>
+              <w:contextualSpacing/>
+              <w:rPr>
+                <w:rFonts w:ascii="Times New Roman" w:hAnsi="Times New Roman" w:cs="Times New Roman"/>
+                <w:sz w:val="26"/>
+                <w:szCs w:val="26"/>
+              </w:rPr>
+            </w:pPr>
+            <w:r>
+              <w:rPr>
+                <w:rFonts w:ascii="Times New Roman" w:hAnsi="Times New Roman" w:cs="Times New Roman"/>
+                <w:color w:val="1F1F1F"/>
+                <w:sz w:val="26"/>
+                <w:szCs w:val="26"/>
+                <w:bdr w:val="none" w:sz="0" w:space="0" w:color="auto" w:frame="1"/>
+              </w:rPr>
+              <w:t>9</w:t>
+            </w:r>
+          </w:p>
+        </w:tc>
+        <w:tc>
+          <w:tcPr>
+            <w:tcW w:w="2462" w:type="dxa"/>
+            <w:vAlign w:val="center"/>
+          </w:tcPr>
+          <w:p>
+            <w:pPr>
+              <w:spacing w:line="360" w:lineRule="auto"/>
+              <w:contextualSpacing/>
+              <w:rPr>
+                <w:rFonts w:ascii="Times New Roman" w:hAnsi="Times New Roman" w:cs="Times New Roman"/>
+                <w:sz w:val="26"/>
+                <w:szCs w:val="26"/>
+              </w:rPr>
+            </w:pPr>
+            <w:r>
+              <w:rPr>
+                <w:rFonts w:ascii="Times New Roman" w:hAnsi="Times New Roman" w:cs="Times New Roman"/>
+                <w:color w:val="1F1F1F"/>
+                <w:sz w:val="26"/>
+                <w:szCs w:val="26"/>
+                <w:bdr w:val="none" w:sz="0" w:space="0" w:color="auto" w:frame="1"/>
+              </w:rPr>
+              <w:t>Table Row</w:t>
+            </w:r>
+          </w:p>
+        </w:tc>
+        <w:tc>
+          <w:tcPr>
+            <w:tcW w:w="1786" w:type="dxa"/>
+            <w:gridSpan w:val="2"/>
+            <w:vAlign w:val="center"/>
+          </w:tcPr>
+          <w:p>
+            <w:pPr>
+              <w:spacing w:line="360" w:lineRule="auto"/>
+              <w:contextualSpacing/>
+              <w:rPr>
+                <w:rFonts w:ascii="Times New Roman" w:hAnsi="Times New Roman" w:cs="Times New Roman"/>
+                <w:sz w:val="26"/>
+                <w:szCs w:val="26"/>
+              </w:rPr>
+            </w:pPr>
+          </w:p>
+        </w:tc>
+        <w:tc>
+          <w:tcPr>
+            <w:tcW w:w="3138" w:type="dxa"/>
+            <w:gridSpan w:val="3"/>
+            <w:vAlign w:val="center"/>
+          </w:tcPr>
+          <w:p>
+            <w:pPr>
+              <w:spacing w:line="360" w:lineRule="auto"/>
+              <w:contextualSpacing/>
+              <w:rPr>
+                <w:rFonts w:ascii="Times New Roman" w:hAnsi="Times New Roman" w:cs="Times New Roman"/>
+                <w:sz w:val="26"/>
+                <w:szCs w:val="26"/>
+              </w:rPr>
+            </w:pPr>
+            <w:r>
+              <w:rPr>
+                <w:rFonts w:ascii="Times New Roman" w:hAnsi="Times New Roman" w:cs="Times New Roman"/>
+                <w:color w:val="1F1F1F"/>
+                <w:sz w:val="26"/>
+                <w:szCs w:val="26"/>
+                <w:bdr w:val="none" w:sz="0" w:space="0" w:color="auto" w:frame="1"/>
+              </w:rPr>
+              <w:t>Dòng dữ liệu thống kê của khoa Toán.</w:t>
+            </w:r>
+          </w:p>
+        </w:tc>
+      </w:tr>
+      <w:tr>
+        <w:trPr>
+          <w:jc w:val="center"/>
+        </w:trPr>
+        <w:tc>
+          <w:tcPr>
+            <w:tcW w:w="8803" w:type="dxa"/>
+            <w:gridSpan w:val="7"/>
+          </w:tcPr>
+          <w:p>
+            <w:pPr>
+              <w:spacing w:line="360" w:lineRule="auto"/>
+              <w:contextualSpacing/>
+              <w:rPr>
+                <w:rFonts w:ascii="Times New Roman" w:hAnsi="Times New Roman" w:cs="Times New Roman"/>
+                <w:b/>
+                <w:sz w:val="26"/>
+                <w:szCs w:val="26"/>
+              </w:rPr>
+            </w:pPr>
+            <w:r>
+              <w:rPr>
+                <w:rFonts w:ascii="Times New Roman" w:hAnsi="Times New Roman" w:cs="Times New Roman"/>
+                <w:b/>
+                <w:sz w:val="26"/>
+                <w:szCs w:val="26"/>
+              </w:rPr>
+              <w:t>Hoạt động</w:t>
+            </w:r>
+          </w:p>
+        </w:tc>
+      </w:tr>
+      <w:tr>
+        <w:trPr>
+          <w:jc w:val="center"/>
+        </w:trPr>
+        <w:tc>
+          <w:tcPr>
+            <w:tcW w:w="1417" w:type="dxa"/>
+            <w:shd w:val="clear" w:color="auto" w:fill="C1E4F5" w:themeFill="accent1" w:themeFillTint="33"/>
+            <w:vAlign w:val="center"/>
+          </w:tcPr>
+          <w:p>
+            <w:pPr>
+              <w:spacing w:line="360" w:lineRule="auto"/>
+              <w:contextualSpacing/>
+              <w:rPr>
+                <w:rFonts w:ascii="Times New Roman" w:hAnsi="Times New Roman" w:cs="Times New Roman"/>
+                <w:b/>
+                <w:sz w:val="26"/>
+                <w:szCs w:val="26"/>
+              </w:rPr>
+            </w:pPr>
+            <w:r>
+              <w:rPr>
+                <w:rStyle w:val="Strong"/>
+                <w:rFonts w:ascii="Times New Roman" w:hAnsi="Times New Roman" w:cs="Times New Roman"/>
+                <w:color w:val="1F1F1F"/>
+                <w:sz w:val="26"/>
+                <w:szCs w:val="26"/>
+                <w:bdr w:val="none" w:sz="0" w:space="0" w:color="auto" w:frame="1"/>
+              </w:rPr>
+              <w:t>Tên</w:t>
+            </w:r>
+          </w:p>
+        </w:tc>
+        <w:tc>
+          <w:tcPr>
+            <w:tcW w:w="2689" w:type="dxa"/>
+            <w:gridSpan w:val="2"/>
+            <w:shd w:val="clear" w:color="auto" w:fill="C1E4F5" w:themeFill="accent1" w:themeFillTint="33"/>
+            <w:vAlign w:val="center"/>
+          </w:tcPr>
+          <w:p>
+            <w:pPr>
+              <w:spacing w:line="360" w:lineRule="auto"/>
+              <w:contextualSpacing/>
+              <w:rPr>
+                <w:rFonts w:ascii="Times New Roman" w:hAnsi="Times New Roman" w:cs="Times New Roman"/>
+                <w:b/>
+                <w:sz w:val="26"/>
+                <w:szCs w:val="26"/>
+              </w:rPr>
+            </w:pPr>
+            <w:r>
+              <w:rPr>
+                <w:rStyle w:val="Strong"/>
+                <w:rFonts w:ascii="Times New Roman" w:hAnsi="Times New Roman" w:cs="Times New Roman"/>
+                <w:color w:val="1F1F1F"/>
+                <w:sz w:val="26"/>
+                <w:szCs w:val="26"/>
+                <w:bdr w:val="none" w:sz="0" w:space="0" w:color="auto" w:frame="1"/>
+              </w:rPr>
+              <w:t>Mô tả</w:t>
+            </w:r>
+          </w:p>
+        </w:tc>
+        <w:tc>
+          <w:tcPr>
+            <w:tcW w:w="2850" w:type="dxa"/>
+            <w:gridSpan w:val="2"/>
+            <w:shd w:val="clear" w:color="auto" w:fill="C1E4F5" w:themeFill="accent1" w:themeFillTint="33"/>
+            <w:vAlign w:val="center"/>
+          </w:tcPr>
+          <w:p>
+            <w:pPr>
+              <w:spacing w:line="360" w:lineRule="auto"/>
+              <w:contextualSpacing/>
+              <w:rPr>
+                <w:rFonts w:ascii="Times New Roman" w:hAnsi="Times New Roman" w:cs="Times New Roman"/>
+                <w:b/>
+                <w:sz w:val="26"/>
+                <w:szCs w:val="26"/>
+              </w:rPr>
+            </w:pPr>
+            <w:r>
+              <w:rPr>
+                <w:rStyle w:val="Strong"/>
+                <w:rFonts w:ascii="Times New Roman" w:hAnsi="Times New Roman" w:cs="Times New Roman"/>
+                <w:color w:val="1F1F1F"/>
+                <w:sz w:val="26"/>
+                <w:szCs w:val="26"/>
+                <w:bdr w:val="none" w:sz="0" w:space="0" w:color="auto" w:frame="1"/>
+              </w:rPr>
+              <w:t>Thành công</w:t>
+            </w:r>
+          </w:p>
+        </w:tc>
+        <w:tc>
+          <w:tcPr>
+            <w:tcW w:w="1847" w:type="dxa"/>
+            <w:gridSpan w:val="2"/>
+            <w:shd w:val="clear" w:color="auto" w:fill="C1E4F5" w:themeFill="accent1" w:themeFillTint="33"/>
+            <w:vAlign w:val="center"/>
+          </w:tcPr>
+          <w:p>
+            <w:pPr>
+              <w:spacing w:line="360" w:lineRule="auto"/>
+              <w:contextualSpacing/>
+              <w:rPr>
+                <w:rFonts w:ascii="Times New Roman" w:hAnsi="Times New Roman" w:cs="Times New Roman"/>
+                <w:b/>
+                <w:sz w:val="26"/>
+                <w:szCs w:val="26"/>
+              </w:rPr>
+            </w:pPr>
+            <w:r>
+              <w:rPr>
+                <w:rStyle w:val="Strong"/>
+                <w:rFonts w:ascii="Times New Roman" w:hAnsi="Times New Roman" w:cs="Times New Roman"/>
+                <w:color w:val="1F1F1F"/>
+                <w:sz w:val="26"/>
+                <w:szCs w:val="26"/>
+                <w:bdr w:val="none" w:sz="0" w:space="0" w:color="auto" w:frame="1"/>
+              </w:rPr>
+              <w:t>Thất bại</w:t>
+            </w:r>
+          </w:p>
+        </w:tc>
+      </w:tr>
+      <w:tr>
+        <w:trPr>
+          <w:jc w:val="center"/>
+        </w:trPr>
+        <w:tc>
+          <w:tcPr>
+            <w:tcW w:w="1417" w:type="dxa"/>
+            <w:vAlign w:val="center"/>
+          </w:tcPr>
+          <w:p>
+            <w:pPr>
+              <w:spacing w:line="360" w:lineRule="auto"/>
+              <w:contextualSpacing/>
+              <w:rPr>
+                <w:rFonts w:ascii="Times New Roman" w:hAnsi="Times New Roman" w:cs="Times New Roman"/>
+                <w:sz w:val="26"/>
+                <w:szCs w:val="26"/>
+              </w:rPr>
+            </w:pPr>
+            <w:r>
+              <w:rPr>
+                <w:rFonts w:ascii="Times New Roman" w:hAnsi="Times New Roman" w:cs="Times New Roman"/>
+                <w:color w:val="1F1F1F"/>
+                <w:sz w:val="26"/>
+                <w:szCs w:val="26"/>
+                <w:bdr w:val="none" w:sz="0" w:space="0" w:color="auto" w:frame="1"/>
+              </w:rPr>
+              <w:lastRenderedPageBreak/>
+              <w:t>Chọn học kỳ</w:t>
+            </w:r>
+          </w:p>
+        </w:tc>
+        <w:tc>
+          <w:tcPr>
+            <w:tcW w:w="2689" w:type="dxa"/>
+            <w:gridSpan w:val="2"/>
+            <w:vAlign w:val="center"/>
+          </w:tcPr>
+          <w:p>
+            <w:pPr>
+              <w:spacing w:line="360" w:lineRule="auto"/>
+              <w:contextualSpacing/>
+              <w:rPr>
+                <w:rFonts w:ascii="Times New Roman" w:hAnsi="Times New Roman" w:cs="Times New Roman"/>
+                <w:sz w:val="26"/>
+                <w:szCs w:val="26"/>
+              </w:rPr>
+            </w:pPr>
+            <w:r>
+              <w:rPr>
+                <w:rFonts w:ascii="Times New Roman" w:hAnsi="Times New Roman" w:cs="Times New Roman"/>
+                <w:color w:val="1F1F1F"/>
+                <w:sz w:val="26"/>
+                <w:szCs w:val="26"/>
+                <w:bdr w:val="none" w:sz="0" w:space="0" w:color="auto" w:frame="1"/>
+              </w:rPr>
+              <w:t>Nhấn chọn học kỳ cụ thể từ danh sách Dropdown</w:t>
+            </w:r>
+          </w:p>
+        </w:tc>
+        <w:tc>
+          <w:tcPr>
+            <w:tcW w:w="2867" w:type="dxa"/>
+            <w:gridSpan w:val="3"/>
+            <w:vAlign w:val="center"/>
+          </w:tcPr>
+          <w:p>
+            <w:pPr>
+              <w:spacing w:line="360" w:lineRule="auto"/>
+              <w:contextualSpacing/>
+              <w:rPr>
+                <w:rFonts w:ascii="Times New Roman" w:hAnsi="Times New Roman" w:cs="Times New Roman"/>
+                <w:sz w:val="26"/>
+                <w:szCs w:val="26"/>
+              </w:rPr>
+            </w:pPr>
+            <w:r>
+              <w:rPr>
+                <w:rFonts w:ascii="Times New Roman" w:hAnsi="Times New Roman" w:cs="Times New Roman"/>
+                <w:color w:val="1F1F1F"/>
+                <w:sz w:val="26"/>
+                <w:szCs w:val="26"/>
+                <w:bdr w:val="none" w:sz="0" w:space="0" w:color="auto" w:frame="1"/>
+              </w:rPr>
+              <w:t>Dữ liệu trên bảng và các thẻ thống kê cập nhật theo học kỳ đã chọn</w:t>
+            </w:r>
+          </w:p>
+        </w:tc>
+        <w:tc>
+          <w:tcPr>
+            <w:tcW w:w="1830" w:type="dxa"/>
+            <w:vAlign w:val="center"/>
+          </w:tcPr>
+          <w:p>
+            <w:pPr>
+              <w:spacing w:line="360" w:lineRule="auto"/>
+              <w:contextualSpacing/>
+              <w:rPr>
+                <w:rFonts w:ascii="Times New Roman" w:hAnsi="Times New Roman" w:cs="Times New Roman"/>
+                <w:sz w:val="26"/>
+                <w:szCs w:val="26"/>
+              </w:rPr>
+            </w:pPr>
+            <w:r>
+              <w:rPr>
+                <w:rFonts w:ascii="Times New Roman" w:hAnsi="Times New Roman" w:cs="Times New Roman"/>
+                <w:color w:val="1F1F1F"/>
+                <w:sz w:val="26"/>
+                <w:szCs w:val="26"/>
+                <w:bdr w:val="none" w:sz="0" w:space="0" w:color="auto" w:frame="1"/>
+              </w:rPr>
+              <w:t>Dữ liệu không thay đổi hoặc báo lỗi tải dữ liệu</w:t>
+            </w:r>
+          </w:p>
+        </w:tc>
+      </w:tr>
+      <w:tr>
+        <w:trPr>
+          <w:jc w:val="center"/>
+        </w:trPr>
+        <w:tc>
+          <w:tcPr>
+            <w:tcW w:w="1417" w:type="dxa"/>
+            <w:vAlign w:val="center"/>
+          </w:tcPr>
+          <w:p>
+            <w:pPr>
+              <w:spacing w:line="360" w:lineRule="auto"/>
+              <w:contextualSpacing/>
+              <w:rPr>
+                <w:rFonts w:ascii="Times New Roman" w:hAnsi="Times New Roman" w:cs="Times New Roman"/>
+                <w:sz w:val="26"/>
+                <w:szCs w:val="26"/>
+              </w:rPr>
+            </w:pPr>
+            <w:r>
+              <w:rPr>
+                <w:rFonts w:ascii="Times New Roman" w:hAnsi="Times New Roman" w:cs="Times New Roman"/>
+                <w:color w:val="1F1F1F"/>
+                <w:sz w:val="26"/>
+                <w:szCs w:val="26"/>
+                <w:bdr w:val="none" w:sz="0" w:space="0" w:color="auto" w:frame="1"/>
+              </w:rPr>
+              <w:t>Xuất báo cáo</w:t>
+            </w:r>
+          </w:p>
+        </w:tc>
+        <w:tc>
+          <w:tcPr>
+            <w:tcW w:w="2689" w:type="dxa"/>
+            <w:gridSpan w:val="2"/>
+            <w:vAlign w:val="center"/>
+          </w:tcPr>
+          <w:p>
+            <w:pPr>
+              <w:spacing w:line="360" w:lineRule="auto"/>
+              <w:contextualSpacing/>
+              <w:rPr>
+                <w:rFonts w:ascii="Times New Roman" w:hAnsi="Times New Roman" w:cs="Times New Roman"/>
+                <w:sz w:val="26"/>
+                <w:szCs w:val="26"/>
+              </w:rPr>
+            </w:pPr>
+            <w:r>
+              <w:rPr>
+                <w:rFonts w:ascii="Times New Roman" w:hAnsi="Times New Roman" w:cs="Times New Roman"/>
+                <w:color w:val="1F1F1F"/>
+                <w:sz w:val="26"/>
+                <w:szCs w:val="26"/>
+                <w:bdr w:val="none" w:sz="0" w:space="0" w:color="auto" w:frame="1"/>
+              </w:rPr>
+              <w:t>Nhấn nút "Xuất báo cáo"</w:t>
+            </w:r>
+          </w:p>
+        </w:tc>
+        <w:tc>
+          <w:tcPr>
+            <w:tcW w:w="2850" w:type="dxa"/>
+            <w:gridSpan w:val="2"/>
+            <w:vAlign w:val="center"/>
+          </w:tcPr>
+          <w:p>
+            <w:pPr>
+              <w:spacing w:line="360" w:lineRule="auto"/>
+              <w:contextualSpacing/>
+              <w:rPr>
+                <w:rFonts w:ascii="Times New Roman" w:hAnsi="Times New Roman" w:cs="Times New Roman"/>
+                <w:sz w:val="26"/>
+                <w:szCs w:val="26"/>
+              </w:rPr>
+            </w:pPr>
+            <w:r>
+              <w:rPr>
+                <w:rFonts w:ascii="Times New Roman" w:hAnsi="Times New Roman" w:cs="Times New Roman"/>
+                <w:color w:val="1F1F1F"/>
+                <w:sz w:val="26"/>
+                <w:szCs w:val="26"/>
+                <w:bdr w:val="none" w:sz="0" w:space="0" w:color="auto" w:frame="1"/>
+              </w:rPr>
+              <w:t>Trình duyệt tải xuống file báo cáo (Excel/PDF) thành công</w:t>
+            </w:r>
+          </w:p>
+        </w:tc>
+        <w:tc>
+          <w:tcPr>
+            <w:tcW w:w="1847" w:type="dxa"/>
+            <w:gridSpan w:val="2"/>
+            <w:vAlign w:val="center"/>
+          </w:tcPr>
+          <w:p>
+            <w:pPr>
+              <w:spacing w:line="360" w:lineRule="auto"/>
+              <w:contextualSpacing/>
+              <w:rPr>
+                <w:rFonts w:ascii="Times New Roman" w:hAnsi="Times New Roman" w:cs="Times New Roman"/>
+                <w:sz w:val="26"/>
+                <w:szCs w:val="26"/>
+              </w:rPr>
+            </w:pPr>
+            <w:r>
+              <w:rPr>
+                <w:rFonts w:ascii="Times New Roman" w:hAnsi="Times New Roman" w:cs="Times New Roman"/>
+                <w:color w:val="1F1F1F"/>
+                <w:sz w:val="26"/>
+                <w:szCs w:val="26"/>
+                <w:bdr w:val="none" w:sz="0" w:space="0" w:color="auto" w:frame="1"/>
+              </w:rPr>
+              <w:t>Báo lỗi không thể trích xuất hoặc tải file</w:t>
+            </w:r>
+          </w:p>
+        </w:tc>
+      </w:tr>
+      <w:tr>
+        <w:trPr>
+          <w:jc w:val="center"/>
+        </w:trPr>
+        <w:tc>
+          <w:tcPr>
+            <w:tcW w:w="1417" w:type="dxa"/>
+            <w:vAlign w:val="center"/>
+          </w:tcPr>
+          <w:p>
+            <w:pPr>
+              <w:spacing w:line="360" w:lineRule="auto"/>
+              <w:contextualSpacing/>
+              <w:rPr>
+                <w:rFonts w:ascii="Times New Roman" w:hAnsi="Times New Roman" w:cs="Times New Roman"/>
+                <w:sz w:val="26"/>
+                <w:szCs w:val="26"/>
+              </w:rPr>
+            </w:pPr>
+            <w:r>
+              <w:rPr>
+                <w:rFonts w:ascii="Times New Roman" w:hAnsi="Times New Roman" w:cs="Times New Roman"/>
+                <w:color w:val="1F1F1F"/>
+                <w:sz w:val="26"/>
+                <w:szCs w:val="26"/>
+                <w:bdr w:val="none" w:sz="0" w:space="0" w:color="auto" w:frame="1"/>
+              </w:rPr>
+              <w:t>Chuyển Tab</w:t>
+            </w:r>
+          </w:p>
+        </w:tc>
+        <w:tc>
+          <w:tcPr>
+            <w:tcW w:w="2689" w:type="dxa"/>
+            <w:gridSpan w:val="2"/>
+            <w:vAlign w:val="center"/>
+          </w:tcPr>
+          <w:p>
+            <w:pPr>
+              <w:spacing w:line="360" w:lineRule="auto"/>
+              <w:contextualSpacing/>
+              <w:rPr>
+                <w:rFonts w:ascii="Times New Roman" w:hAnsi="Times New Roman" w:cs="Times New Roman"/>
+                <w:sz w:val="26"/>
+                <w:szCs w:val="26"/>
+              </w:rPr>
+            </w:pPr>
+            <w:r>
+              <w:rPr>
+                <w:rFonts w:ascii="Times New Roman" w:hAnsi="Times New Roman" w:cs="Times New Roman"/>
+                <w:color w:val="1F1F1F"/>
+                <w:sz w:val="26"/>
+                <w:szCs w:val="26"/>
+                <w:bdr w:val="none" w:sz="0" w:space="0" w:color="auto" w:frame="1"/>
+              </w:rPr>
+              <w:t>Nhấn chọn các tab "Chuyên cần", "Điểm số", "Học phần"</w:t>
+            </w:r>
+          </w:p>
+        </w:tc>
+        <w:tc>
+          <w:tcPr>
+            <w:tcW w:w="2850" w:type="dxa"/>
+            <w:gridSpan w:val="2"/>
+            <w:vAlign w:val="center"/>
+          </w:tcPr>
+          <w:p>
+            <w:pPr>
+              <w:spacing w:line="360" w:lineRule="auto"/>
+              <w:contextualSpacing/>
+              <w:rPr>
+                <w:rFonts w:ascii="Times New Roman" w:hAnsi="Times New Roman" w:cs="Times New Roman"/>
+                <w:sz w:val="26"/>
+                <w:szCs w:val="26"/>
+              </w:rPr>
+            </w:pPr>
+            <w:r>
+              <w:rPr>
+                <w:rFonts w:ascii="Times New Roman" w:hAnsi="Times New Roman" w:cs="Times New Roman"/>
+                <w:color w:val="1F1F1F"/>
+                <w:sz w:val="26"/>
+                <w:szCs w:val="26"/>
+                <w:bdr w:val="none" w:sz="0" w:space="0" w:color="auto" w:frame="1"/>
+              </w:rPr>
+              <w:t>Giao diện chuyển sang màn hình thống kê tương ứng với tab được chọn</w:t>
+            </w:r>
+          </w:p>
+        </w:tc>
+        <w:tc>
+          <w:tcPr>
+            <w:tcW w:w="1847" w:type="dxa"/>
+            <w:gridSpan w:val="2"/>
+            <w:vAlign w:val="center"/>
+          </w:tcPr>
+          <w:p>
+            <w:pPr>
+              <w:spacing w:line="360" w:lineRule="auto"/>
+              <w:contextualSpacing/>
+              <w:rPr>
+                <w:rFonts w:ascii="Times New Roman" w:hAnsi="Times New Roman" w:cs="Times New Roman"/>
+                <w:sz w:val="26"/>
+                <w:szCs w:val="26"/>
+              </w:rPr>
+            </w:pPr>
+            <w:r>
+              <w:rPr>
+                <w:rFonts w:ascii="Times New Roman" w:hAnsi="Times New Roman" w:cs="Times New Roman"/>
+                <w:color w:val="1F1F1F"/>
+                <w:sz w:val="26"/>
+                <w:szCs w:val="26"/>
+                <w:bdr w:val="none" w:sz="0" w:space="0" w:color="auto" w:frame="1"/>
+              </w:rPr>
+              <w:t>Không phản hồi khi nhấn chọn</w:t>
+            </w:r>
+          </w:p>
+        </w:tc>
+      </w:tr>
+    </w:tbl>
     <w:p>
       <w:pPr>
         <w:spacing w:after="0" w:line="360" w:lineRule="auto"/>
@@ -1018,6 +5014,7 @@
   <w:style w:type="character" w:default="1" w:styleId="DefaultParagraphFont">
     <w:name w:val="Default Paragraph Font"/>
     <w:uiPriority w:val="1"/>
+    <w:semiHidden/>
     <w:unhideWhenUsed/>
   </w:style>
   <w:style w:type="table" w:default="1" w:styleId="TableNormal">
@@ -1329,6 +5326,62 @@
       <w:smallCaps/>
       <w:color w:val="0F4761" w:themeColor="accent1" w:themeShade="BF"/>
       <w:spacing w:val="5"/>
+    </w:rPr>
+  </w:style>
+  <w:style w:type="table" w:customStyle="1" w:styleId="TableGrid3">
+    <w:name w:val="Table Grid3"/>
+    <w:basedOn w:val="TableNormal"/>
+    <w:next w:val="TableGrid"/>
+    <w:uiPriority w:val="59"/>
+    <w:rsid w:val="00A40B7B"/>
+    <w:pPr>
+      <w:spacing w:after="0" w:line="240" w:lineRule="auto"/>
+    </w:pPr>
+    <w:rPr>
+      <w:kern w:val="0"/>
+      <w:sz w:val="22"/>
+      <w:szCs w:val="22"/>
+      <w14:ligatures w14:val="none"/>
+    </w:rPr>
+    <w:tblPr>
+      <w:tblBorders>
+        <w:top w:val="single" w:sz="4" w:space="0" w:color="auto"/>
+        <w:left w:val="single" w:sz="4" w:space="0" w:color="auto"/>
+        <w:bottom w:val="single" w:sz="4" w:space="0" w:color="auto"/>
+        <w:right w:val="single" w:sz="4" w:space="0" w:color="auto"/>
+        <w:insideH w:val="single" w:sz="4" w:space="0" w:color="auto"/>
+        <w:insideV w:val="single" w:sz="4" w:space="0" w:color="auto"/>
+      </w:tblBorders>
+    </w:tblPr>
+  </w:style>
+  <w:style w:type="table" w:styleId="TableGrid">
+    <w:name w:val="Table Grid"/>
+    <w:basedOn w:val="TableNormal"/>
+    <w:uiPriority w:val="39"/>
+    <w:rsid w:val="00A40B7B"/>
+    <w:pPr>
+      <w:spacing w:after="0" w:line="240" w:lineRule="auto"/>
+    </w:pPr>
+    <w:tblPr>
+      <w:tblBorders>
+        <w:top w:val="single" w:sz="4" w:space="0" w:color="auto"/>
+        <w:left w:val="single" w:sz="4" w:space="0" w:color="auto"/>
+        <w:bottom w:val="single" w:sz="4" w:space="0" w:color="auto"/>
+        <w:right w:val="single" w:sz="4" w:space="0" w:color="auto"/>
+        <w:insideH w:val="single" w:sz="4" w:space="0" w:color="auto"/>
+        <w:insideV w:val="single" w:sz="4" w:space="0" w:color="auto"/>
+      </w:tblBorders>
+    </w:tblPr>
+  </w:style>
+  <w:style w:type="character" w:styleId="Strong">
+    <w:name w:val="Strong"/>
+    <w:basedOn w:val="DefaultParagraphFont"/>
+    <w:uiPriority w:val="22"/>
+    <w:qFormat/>
+    <w:rsid w:val="00210386"/>
+    <w:rPr>
+      <w:b/>
+      <w:bCs/>
     </w:rPr>
   </w:style>
 </w:styles>

</xml_diff>